<commit_message>
Substitui modelos PCMD pelo pacote recebido e adapta preenchimento
</commit_message>
<xml_diff>
--- a/public/modelos/PCMD-W1-Manual-Gestao-Ativos-Exemplo.docx
+++ b/public/modelos/PCMD-W1-Manual-Gestao-Ativos-Exemplo.docx
@@ -49,14 +49,14 @@
       <w:pPr>
         <w:pStyle w:val="DestaquePCMD"/>
         <w:pBdr>
-          <w:left w:val="single" w:sz="24" w:space="6" w:color="0B3D63"/>
+          <w:left w:val="single" w:sz="24" w:space="6" w:color="0B2A5B"/>
         </w:pBdr>
         <w:shd w:val="clear" w:color="auto" w:fill="EEF2F8"/>
       </w:pPr>
       <w:r>
         <w:rPr>
           <w:rFonts w:ascii="Arial Black" w:hAnsi="Arial Black" w:cs="Arial Black"/>
-          <w:color w:val="0B3D63"/>
+          <w:color w:val="0B2A5B"/>
           <w:sz w:val="16"/>
         </w:rPr>
         <w:t xml:space="preserve">NOTA   </w:t>
@@ -71,7 +71,7 @@
         <w:keepNext/>
       </w:pPr>
       <w:r>
-        <w:t>Referências registradas (PCMD-01, aba Requisitos)</w:t>
+        <w:t>Referências registradas (PCMD-01, aba Cadastros)</w:t>
       </w:r>
     </w:p>
     <w:tbl>
@@ -114,7 +114,7 @@
             <w:tcW w:type="dxa" w:w="2948"/>
             <w:shd w:val="clear" w:color="auto" w:fill="DCE6F5"/>
             <w:tcBorders>
-              <w:bottom w:val="single" w:sz="8" w:space="0" w:color="0B3D63"/>
+              <w:bottom w:val="single" w:sz="8" w:space="0" w:color="0B2A5B"/>
             </w:tcBorders>
           </w:tcPr>
           <w:p>
@@ -125,7 +125,7 @@
             <w:r>
               <w:rPr>
                 <w:b/>
-                <w:color w:val="0B3D63"/>
+                <w:color w:val="0B2A5B"/>
               </w:rPr>
               <w:t>Referência</w:t>
             </w:r>
@@ -136,7 +136,7 @@
             <w:tcW w:type="dxa" w:w="1134"/>
             <w:shd w:val="clear" w:color="auto" w:fill="DCE6F5"/>
             <w:tcBorders>
-              <w:bottom w:val="single" w:sz="8" w:space="0" w:color="0B3D63"/>
+              <w:bottom w:val="single" w:sz="8" w:space="0" w:color="0B2A5B"/>
             </w:tcBorders>
           </w:tcPr>
           <w:p>
@@ -147,7 +147,7 @@
             <w:r>
               <w:rPr>
                 <w:b/>
-                <w:color w:val="0B3D63"/>
+                <w:color w:val="0B2A5B"/>
               </w:rPr>
               <w:t>Versão</w:t>
             </w:r>
@@ -158,7 +158,7 @@
             <w:tcW w:type="dxa" w:w="1304"/>
             <w:shd w:val="clear" w:color="auto" w:fill="DCE6F5"/>
             <w:tcBorders>
-              <w:bottom w:val="single" w:sz="8" w:space="0" w:color="0B3D63"/>
+              <w:bottom w:val="single" w:sz="8" w:space="0" w:color="0B2A5B"/>
             </w:tcBorders>
           </w:tcPr>
           <w:p>
@@ -169,7 +169,7 @@
             <w:r>
               <w:rPr>
                 <w:b/>
-                <w:color w:val="0B3D63"/>
+                <w:color w:val="0B2A5B"/>
               </w:rPr>
               <w:t>Data</w:t>
             </w:r>
@@ -180,7 +180,7 @@
             <w:tcW w:type="dxa" w:w="2665"/>
             <w:shd w:val="clear" w:color="auto" w:fill="DCE6F5"/>
             <w:tcBorders>
-              <w:bottom w:val="single" w:sz="8" w:space="0" w:color="0B3D63"/>
+              <w:bottom w:val="single" w:sz="8" w:space="0" w:color="0B2A5B"/>
             </w:tcBorders>
           </w:tcPr>
           <w:p>
@@ -191,7 +191,7 @@
             <w:r>
               <w:rPr>
                 <w:b/>
-                <w:color w:val="0B3D63"/>
+                <w:color w:val="0B2A5B"/>
               </w:rPr>
               <w:t>Fonte (HTTPS)</w:t>
             </w:r>
@@ -202,7 +202,7 @@
             <w:tcW w:type="dxa" w:w="1587"/>
             <w:shd w:val="clear" w:color="auto" w:fill="DCE6F5"/>
             <w:tcBorders>
-              <w:bottom w:val="single" w:sz="8" w:space="0" w:color="0B3D63"/>
+              <w:bottom w:val="single" w:sz="8" w:space="0" w:color="0B2A5B"/>
             </w:tcBorders>
           </w:tcPr>
           <w:p>
@@ -213,7 +213,7 @@
             <w:r>
               <w:rPr>
                 <w:b/>
-                <w:color w:val="0B3D63"/>
+                <w:color w:val="0B2A5B"/>
               </w:rPr>
               <w:t>Status</w:t>
             </w:r>
@@ -337,7 +337,7 @@
             <w:tcW w:type="dxa" w:w="2551"/>
             <w:shd w:val="clear" w:color="auto" w:fill="DCE6F5"/>
             <w:tcBorders>
-              <w:bottom w:val="single" w:sz="8" w:space="0" w:color="0B3D63"/>
+              <w:bottom w:val="single" w:sz="8" w:space="0" w:color="0B2A5B"/>
             </w:tcBorders>
           </w:tcPr>
           <w:p>
@@ -348,7 +348,7 @@
             <w:r>
               <w:rPr>
                 <w:b/>
-                <w:color w:val="0B3D63"/>
+                <w:color w:val="0B2A5B"/>
               </w:rPr>
               <w:t>Termo</w:t>
             </w:r>
@@ -359,7 +359,7 @@
             <w:tcW w:type="dxa" w:w="7087"/>
             <w:shd w:val="clear" w:color="auto" w:fill="DCE6F5"/>
             <w:tcBorders>
-              <w:bottom w:val="single" w:sz="8" w:space="0" w:color="0B3D63"/>
+              <w:bottom w:val="single" w:sz="8" w:space="0" w:color="0B2A5B"/>
             </w:tcBorders>
           </w:tcPr>
           <w:p>
@@ -370,7 +370,7 @@
             <w:r>
               <w:rPr>
                 <w:b/>
-                <w:color w:val="0B3D63"/>
+                <w:color w:val="0B2A5B"/>
               </w:rPr>
               <w:t>Definição</w:t>
             </w:r>
@@ -663,7 +663,7 @@
             <w:tcW w:type="dxa" w:w="2381"/>
             <w:shd w:val="clear" w:color="auto" w:fill="DCE6F5"/>
             <w:tcBorders>
-              <w:bottom w:val="single" w:sz="8" w:space="0" w:color="0B3D63"/>
+              <w:bottom w:val="single" w:sz="8" w:space="0" w:color="0B2A5B"/>
             </w:tcBorders>
           </w:tcPr>
           <w:p>
@@ -674,7 +674,7 @@
             <w:r>
               <w:rPr>
                 <w:b/>
-                <w:color w:val="0B3D63"/>
+                <w:color w:val="0B2A5B"/>
               </w:rPr>
               <w:t>Papel</w:t>
             </w:r>
@@ -685,7 +685,7 @@
             <w:tcW w:type="dxa" w:w="4989"/>
             <w:shd w:val="clear" w:color="auto" w:fill="DCE6F5"/>
             <w:tcBorders>
-              <w:bottom w:val="single" w:sz="8" w:space="0" w:color="0B3D63"/>
+              <w:bottom w:val="single" w:sz="8" w:space="0" w:color="0B2A5B"/>
             </w:tcBorders>
           </w:tcPr>
           <w:p>
@@ -696,7 +696,7 @@
             <w:r>
               <w:rPr>
                 <w:b/>
-                <w:color w:val="0B3D63"/>
+                <w:color w:val="0B2A5B"/>
               </w:rPr>
               <w:t>Responsabilidade</w:t>
             </w:r>
@@ -707,7 +707,7 @@
             <w:tcW w:type="dxa" w:w="2268"/>
             <w:shd w:val="clear" w:color="auto" w:fill="DCE6F5"/>
             <w:tcBorders>
-              <w:bottom w:val="single" w:sz="8" w:space="0" w:color="0B3D63"/>
+              <w:bottom w:val="single" w:sz="8" w:space="0" w:color="0B2A5B"/>
             </w:tcBorders>
           </w:tcPr>
           <w:p>
@@ -718,7 +718,7 @@
             <w:r>
               <w:rPr>
                 <w:b/>
-                <w:color w:val="0B3D63"/>
+                <w:color w:val="0B2A5B"/>
               </w:rPr>
               <w:t>Pessoa</w:t>
             </w:r>
@@ -921,7 +921,7 @@
         <w:keepNext/>
       </w:pPr>
       <w:r>
-        <w:t>Pessoas ativas (PCMD-01, aba Pessoas)</w:t>
+        <w:t>Pessoas ativas (PCMD-01, aba Cadastros)</w:t>
       </w:r>
     </w:p>
     <w:tbl>
@@ -963,7 +963,7 @@
             <w:tcW w:type="dxa" w:w="2268"/>
             <w:shd w:val="clear" w:color="auto" w:fill="DCE6F5"/>
             <w:tcBorders>
-              <w:bottom w:val="single" w:sz="8" w:space="0" w:color="0B3D63"/>
+              <w:bottom w:val="single" w:sz="8" w:space="0" w:color="0B2A5B"/>
             </w:tcBorders>
           </w:tcPr>
           <w:p>
@@ -974,7 +974,7 @@
             <w:r>
               <w:rPr>
                 <w:b/>
-                <w:color w:val="0B3D63"/>
+                <w:color w:val="0B2A5B"/>
               </w:rPr>
               <w:t>Nome</w:t>
             </w:r>
@@ -985,7 +985,7 @@
             <w:tcW w:type="dxa" w:w="2494"/>
             <w:shd w:val="clear" w:color="auto" w:fill="DCE6F5"/>
             <w:tcBorders>
-              <w:bottom w:val="single" w:sz="8" w:space="0" w:color="0B3D63"/>
+              <w:bottom w:val="single" w:sz="8" w:space="0" w:color="0B2A5B"/>
             </w:tcBorders>
           </w:tcPr>
           <w:p>
@@ -996,7 +996,7 @@
             <w:r>
               <w:rPr>
                 <w:b/>
-                <w:color w:val="0B3D63"/>
+                <w:color w:val="0B2A5B"/>
               </w:rPr>
               <w:t>Função</w:t>
             </w:r>
@@ -1007,7 +1007,7 @@
             <w:tcW w:type="dxa" w:w="1928"/>
             <w:shd w:val="clear" w:color="auto" w:fill="DCE6F5"/>
             <w:tcBorders>
-              <w:bottom w:val="single" w:sz="8" w:space="0" w:color="0B3D63"/>
+              <w:bottom w:val="single" w:sz="8" w:space="0" w:color="0B2A5B"/>
             </w:tcBorders>
           </w:tcPr>
           <w:p>
@@ -1018,7 +1018,7 @@
             <w:r>
               <w:rPr>
                 <w:b/>
-                <w:color w:val="0B3D63"/>
+                <w:color w:val="0B2A5B"/>
               </w:rPr>
               <w:t>Especialidade</w:t>
             </w:r>
@@ -1029,7 +1029,7 @@
             <w:tcW w:type="dxa" w:w="2948"/>
             <w:shd w:val="clear" w:color="auto" w:fill="DCE6F5"/>
             <w:tcBorders>
-              <w:bottom w:val="single" w:sz="8" w:space="0" w:color="0B3D63"/>
+              <w:bottom w:val="single" w:sz="8" w:space="0" w:color="0B2A5B"/>
             </w:tcBorders>
           </w:tcPr>
           <w:p>
@@ -1040,7 +1040,7 @@
             <w:r>
               <w:rPr>
                 <w:b/>
-                <w:color w:val="0B3D63"/>
+                <w:color w:val="0B2A5B"/>
               </w:rPr>
               <w:t>Responsabilidade neste manual (manual)</w:t>
             </w:r>
@@ -1099,7 +1099,7 @@
               <w:pStyle w:val="TabelaPCMD"/>
             </w:pPr>
             <w:r>
-              <w:t>A definir</w:t>
+              <w:t>Elabora e mantém os registros</w:t>
             </w:r>
           </w:p>
         </w:tc>
@@ -1156,7 +1156,7 @@
               <w:pStyle w:val="TabelaPCMD"/>
             </w:pPr>
             <w:r>
-              <w:t>A definir</w:t>
+              <w:t>Executa e registra as tarefas</w:t>
             </w:r>
           </w:p>
         </w:tc>
@@ -1229,7 +1229,7 @@
             <w:tcW w:type="dxa" w:w="1984"/>
             <w:shd w:val="clear" w:color="auto" w:fill="DCE6F5"/>
             <w:tcBorders>
-              <w:bottom w:val="single" w:sz="8" w:space="0" w:color="0B3D63"/>
+              <w:bottom w:val="single" w:sz="8" w:space="0" w:color="0B2A5B"/>
             </w:tcBorders>
           </w:tcPr>
           <w:p>
@@ -1240,7 +1240,7 @@
             <w:r>
               <w:rPr>
                 <w:b/>
-                <w:color w:val="0B3D63"/>
+                <w:color w:val="0B2A5B"/>
               </w:rPr>
               <w:t>Item</w:t>
             </w:r>
@@ -1251,7 +1251,7 @@
             <w:tcW w:type="dxa" w:w="7654"/>
             <w:shd w:val="clear" w:color="auto" w:fill="DCE6F5"/>
             <w:tcBorders>
-              <w:bottom w:val="single" w:sz="8" w:space="0" w:color="0B3D63"/>
+              <w:bottom w:val="single" w:sz="8" w:space="0" w:color="0B2A5B"/>
             </w:tcBorders>
           </w:tcPr>
           <w:p>
@@ -1262,7 +1262,7 @@
             <w:r>
               <w:rPr>
                 <w:b/>
-                <w:color w:val="0B3D63"/>
+                <w:color w:val="0B2A5B"/>
               </w:rPr>
               <w:t>Regra</w:t>
             </w:r>
@@ -1413,7 +1413,7 @@
         <w:keepNext/>
       </w:pPr>
       <w:r>
-        <w:t>Setores cadastrados (PCMD-02, aba Setores)</w:t>
+        <w:t>Setores cadastrados (PCMD-02, aba Cadastros)</w:t>
       </w:r>
     </w:p>
     <w:tbl>
@@ -1453,7 +1453,7 @@
             <w:tcW w:type="dxa" w:w="1701"/>
             <w:shd w:val="clear" w:color="auto" w:fill="DCE6F5"/>
             <w:tcBorders>
-              <w:bottom w:val="single" w:sz="8" w:space="0" w:color="0B3D63"/>
+              <w:bottom w:val="single" w:sz="8" w:space="0" w:color="0B2A5B"/>
             </w:tcBorders>
           </w:tcPr>
           <w:p>
@@ -1464,7 +1464,7 @@
             <w:r>
               <w:rPr>
                 <w:b/>
-                <w:color w:val="0B3D63"/>
+                <w:color w:val="0B2A5B"/>
               </w:rPr>
               <w:t>Sigla</w:t>
             </w:r>
@@ -1475,7 +1475,7 @@
             <w:tcW w:type="dxa" w:w="7937"/>
             <w:shd w:val="clear" w:color="auto" w:fill="DCE6F5"/>
             <w:tcBorders>
-              <w:bottom w:val="single" w:sz="8" w:space="0" w:color="0B3D63"/>
+              <w:bottom w:val="single" w:sz="8" w:space="0" w:color="0B2A5B"/>
             </w:tcBorders>
           </w:tcPr>
           <w:p>
@@ -1486,7 +1486,7 @@
             <w:r>
               <w:rPr>
                 <w:b/>
-                <w:color w:val="0B3D63"/>
+                <w:color w:val="0B2A5B"/>
               </w:rPr>
               <w:t>Descrição (manual)</w:t>
             </w:r>
@@ -1519,7 +1519,7 @@
               <w:pStyle w:val="TabelaPCMD"/>
             </w:pPr>
             <w:r>
-              <w:t>A definir</w:t>
+              <w:t>Utilidades</w:t>
             </w:r>
           </w:p>
         </w:tc>
@@ -1550,7 +1550,7 @@
               <w:pStyle w:val="TabelaPCMD"/>
             </w:pPr>
             <w:r>
-              <w:t>A definir</w:t>
+              <w:t>Produção</w:t>
             </w:r>
           </w:p>
         </w:tc>
@@ -1581,7 +1581,7 @@
               <w:pStyle w:val="TabelaPCMD"/>
             </w:pPr>
             <w:r>
-              <w:t>A definir</w:t>
+              <w:t>Expedição</w:t>
             </w:r>
           </w:p>
         </w:tc>
@@ -1647,7 +1647,7 @@
             <w:tcW w:type="dxa" w:w="6803"/>
             <w:shd w:val="clear" w:color="auto" w:fill="DCE6F5"/>
             <w:tcBorders>
-              <w:bottom w:val="single" w:sz="8" w:space="0" w:color="0B3D63"/>
+              <w:bottom w:val="single" w:sz="8" w:space="0" w:color="0B2A5B"/>
             </w:tcBorders>
           </w:tcPr>
           <w:p>
@@ -1658,7 +1658,7 @@
             <w:r>
               <w:rPr>
                 <w:b/>
-                <w:color w:val="0B3D63"/>
+                <w:color w:val="0B2A5B"/>
               </w:rPr>
               <w:t>Situação</w:t>
             </w:r>
@@ -1669,7 +1669,7 @@
             <w:tcW w:type="dxa" w:w="2835"/>
             <w:shd w:val="clear" w:color="auto" w:fill="DCE6F5"/>
             <w:tcBorders>
-              <w:bottom w:val="single" w:sz="8" w:space="0" w:color="0B3D63"/>
+              <w:bottom w:val="single" w:sz="8" w:space="0" w:color="0B2A5B"/>
             </w:tcBorders>
           </w:tcPr>
           <w:p>
@@ -1680,7 +1680,7 @@
             <w:r>
               <w:rPr>
                 <w:b/>
-                <w:color w:val="0B3D63"/>
+                <w:color w:val="0B2A5B"/>
               </w:rPr>
               <w:t>Classe</w:t>
             </w:r>
@@ -1965,7 +1965,7 @@
             <w:tcW w:type="dxa" w:w="2494"/>
             <w:shd w:val="clear" w:color="auto" w:fill="DCE6F5"/>
             <w:tcBorders>
-              <w:bottom w:val="single" w:sz="8" w:space="0" w:color="0B3D63"/>
+              <w:bottom w:val="single" w:sz="8" w:space="0" w:color="0B2A5B"/>
             </w:tcBorders>
           </w:tcPr>
           <w:p>
@@ -1976,7 +1976,7 @@
             <w:r>
               <w:rPr>
                 <w:b/>
-                <w:color w:val="0B3D63"/>
+                <w:color w:val="0B2A5B"/>
               </w:rPr>
               <w:t>Critério</w:t>
             </w:r>
@@ -1987,7 +1987,7 @@
             <w:tcW w:type="dxa" w:w="2381"/>
             <w:shd w:val="clear" w:color="auto" w:fill="DCE6F5"/>
             <w:tcBorders>
-              <w:bottom w:val="single" w:sz="8" w:space="0" w:color="0B3D63"/>
+              <w:bottom w:val="single" w:sz="8" w:space="0" w:color="0B2A5B"/>
             </w:tcBorders>
           </w:tcPr>
           <w:p>
@@ -1998,7 +1998,7 @@
             <w:r>
               <w:rPr>
                 <w:b/>
-                <w:color w:val="0B3D63"/>
+                <w:color w:val="0B2A5B"/>
               </w:rPr>
               <w:t>Nível 1</w:t>
             </w:r>
@@ -2009,7 +2009,7 @@
             <w:tcW w:type="dxa" w:w="2381"/>
             <w:shd w:val="clear" w:color="auto" w:fill="DCE6F5"/>
             <w:tcBorders>
-              <w:bottom w:val="single" w:sz="8" w:space="0" w:color="0B3D63"/>
+              <w:bottom w:val="single" w:sz="8" w:space="0" w:color="0B2A5B"/>
             </w:tcBorders>
           </w:tcPr>
           <w:p>
@@ -2020,7 +2020,7 @@
             <w:r>
               <w:rPr>
                 <w:b/>
-                <w:color w:val="0B3D63"/>
+                <w:color w:val="0B2A5B"/>
               </w:rPr>
               <w:t>Nível 2</w:t>
             </w:r>
@@ -2031,7 +2031,7 @@
             <w:tcW w:type="dxa" w:w="2381"/>
             <w:shd w:val="clear" w:color="auto" w:fill="DCE6F5"/>
             <w:tcBorders>
-              <w:bottom w:val="single" w:sz="8" w:space="0" w:color="0B3D63"/>
+              <w:bottom w:val="single" w:sz="8" w:space="0" w:color="0B2A5B"/>
             </w:tcBorders>
           </w:tcPr>
           <w:p>
@@ -2042,7 +2042,7 @@
             <w:r>
               <w:rPr>
                 <w:b/>
-                <w:color w:val="0B3D63"/>
+                <w:color w:val="0B2A5B"/>
               </w:rPr>
               <w:t>Nível 3</w:t>
             </w:r>
@@ -2078,7 +2078,7 @@
               <w:pStyle w:val="TabelaPCMD"/>
             </w:pPr>
             <w:r>
-              <w:t>A definir pelo mantenedor</w:t>
+              <w:t>Sem risco à pessoa</w:t>
             </w:r>
           </w:p>
         </w:tc>
@@ -2091,7 +2091,7 @@
               <w:pStyle w:val="TabelaPCMD"/>
             </w:pPr>
             <w:r>
-              <w:t>A definir pelo mantenedor</w:t>
+              <w:t>Risco leve, controlado por EPI</w:t>
             </w:r>
           </w:p>
         </w:tc>
@@ -2104,7 +2104,7 @@
               <w:pStyle w:val="TabelaPCMD"/>
             </w:pPr>
             <w:r>
-              <w:t>A definir pelo mantenedor</w:t>
+              <w:t>Risco grave à pessoa</w:t>
             </w:r>
           </w:p>
         </w:tc>
@@ -2138,7 +2138,7 @@
               <w:pStyle w:val="TabelaPCMD"/>
             </w:pPr>
             <w:r>
-              <w:t>A definir pelo mantenedor</w:t>
+              <w:t>Sem efeito no produto</w:t>
             </w:r>
           </w:p>
         </w:tc>
@@ -2151,7 +2151,7 @@
               <w:pStyle w:val="TabelaPCMD"/>
             </w:pPr>
             <w:r>
-              <w:t>A definir pelo mantenedor</w:t>
+              <w:t>Gera retrabalho</w:t>
             </w:r>
           </w:p>
         </w:tc>
@@ -2164,7 +2164,7 @@
               <w:pStyle w:val="TabelaPCMD"/>
             </w:pPr>
             <w:r>
-              <w:t>A definir pelo mantenedor</w:t>
+              <w:t>Gera refugo ou reclamação</w:t>
             </w:r>
           </w:p>
         </w:tc>
@@ -2198,7 +2198,7 @@
               <w:pStyle w:val="TabelaPCMD"/>
             </w:pPr>
             <w:r>
-              <w:t>A definir pelo mantenedor</w:t>
+              <w:t>Não afeta a produção</w:t>
             </w:r>
           </w:p>
         </w:tc>
@@ -2211,7 +2211,7 @@
               <w:pStyle w:val="TabelaPCMD"/>
             </w:pPr>
             <w:r>
-              <w:t>A definir pelo mantenedor</w:t>
+              <w:t>Reduz o ritmo</w:t>
             </w:r>
           </w:p>
         </w:tc>
@@ -2224,7 +2224,7 @@
               <w:pStyle w:val="TabelaPCMD"/>
             </w:pPr>
             <w:r>
-              <w:t>A definir pelo mantenedor</w:t>
+              <w:t>Para a produção</w:t>
             </w:r>
           </w:p>
         </w:tc>
@@ -2258,7 +2258,7 @@
               <w:pStyle w:val="TabelaPCMD"/>
             </w:pPr>
             <w:r>
-              <w:t>A definir pelo mantenedor</w:t>
+              <w:t>Rara (mais de 1 ano)</w:t>
             </w:r>
           </w:p>
         </w:tc>
@@ -2271,7 +2271,7 @@
               <w:pStyle w:val="TabelaPCMD"/>
             </w:pPr>
             <w:r>
-              <w:t>A definir pelo mantenedor</w:t>
+              <w:t>Ocasional (1 a 12 meses)</w:t>
             </w:r>
           </w:p>
         </w:tc>
@@ -2284,7 +2284,7 @@
               <w:pStyle w:val="TabelaPCMD"/>
             </w:pPr>
             <w:r>
-              <w:t>A definir pelo mantenedor</w:t>
+              <w:t>Frequente (menos de 1 mês)</w:t>
             </w:r>
           </w:p>
         </w:tc>
@@ -2318,7 +2318,7 @@
               <w:pStyle w:val="TabelaPCMD"/>
             </w:pPr>
             <w:r>
-              <w:t>A definir pelo mantenedor</w:t>
+              <w:t>Reparo em até 4 h</w:t>
             </w:r>
           </w:p>
         </w:tc>
@@ -2331,7 +2331,7 @@
               <w:pStyle w:val="TabelaPCMD"/>
             </w:pPr>
             <w:r>
-              <w:t>A definir pelo mantenedor</w:t>
+              <w:t>Reparo de 4 a 24 h</w:t>
             </w:r>
           </w:p>
         </w:tc>
@@ -2344,7 +2344,7 @@
               <w:pStyle w:val="TabelaPCMD"/>
             </w:pPr>
             <w:r>
-              <w:t>A definir pelo mantenedor</w:t>
+              <w:t>Reparo acima de 24 h</w:t>
             </w:r>
           </w:p>
         </w:tc>
@@ -2355,14 +2355,14 @@
       <w:pPr>
         <w:pStyle w:val="DestaquePCMD"/>
         <w:pBdr>
-          <w:left w:val="single" w:sz="24" w:space="6" w:color="0B3D63"/>
+          <w:left w:val="single" w:sz="24" w:space="6" w:color="0B2A5B"/>
         </w:pBdr>
         <w:shd w:val="clear" w:color="auto" w:fill="EEF2F8"/>
       </w:pPr>
       <w:r>
         <w:rPr>
           <w:rFonts w:ascii="Arial Black" w:hAnsi="Arial Black" w:cs="Arial Black"/>
-          <w:color w:val="0B3D63"/>
+          <w:color w:val="0B2A5B"/>
           <w:sz w:val="16"/>
         </w:rPr>
         <w:t xml:space="preserve">NOTA   </w:t>
@@ -2416,7 +2416,7 @@
             <w:tcW w:type="dxa" w:w="3118"/>
             <w:shd w:val="clear" w:color="auto" w:fill="DCE6F5"/>
             <w:tcBorders>
-              <w:bottom w:val="single" w:sz="8" w:space="0" w:color="0B3D63"/>
+              <w:bottom w:val="single" w:sz="8" w:space="0" w:color="0B2A5B"/>
             </w:tcBorders>
           </w:tcPr>
           <w:p>
@@ -2427,7 +2427,7 @@
             <w:r>
               <w:rPr>
                 <w:b/>
-                <w:color w:val="0B3D63"/>
+                <w:color w:val="0B2A5B"/>
               </w:rPr>
               <w:t>Situação</w:t>
             </w:r>
@@ -2438,7 +2438,7 @@
             <w:tcW w:type="dxa" w:w="6520"/>
             <w:shd w:val="clear" w:color="auto" w:fill="DCE6F5"/>
             <w:tcBorders>
-              <w:bottom w:val="single" w:sz="8" w:space="0" w:color="0B3D63"/>
+              <w:bottom w:val="single" w:sz="8" w:space="0" w:color="0B2A5B"/>
             </w:tcBorders>
           </w:tcPr>
           <w:p>
@@ -2449,7 +2449,7 @@
             <w:r>
               <w:rPr>
                 <w:b/>
-                <w:color w:val="0B3D63"/>
+                <w:color w:val="0B2A5B"/>
               </w:rPr>
               <w:t>O que acontece</w:t>
             </w:r>
@@ -2678,7 +2678,7 @@
             <w:tcW w:type="dxa" w:w="1701"/>
             <w:shd w:val="clear" w:color="auto" w:fill="DCE6F5"/>
             <w:tcBorders>
-              <w:bottom w:val="single" w:sz="8" w:space="0" w:color="0B3D63"/>
+              <w:bottom w:val="single" w:sz="8" w:space="0" w:color="0B2A5B"/>
             </w:tcBorders>
           </w:tcPr>
           <w:p>
@@ -2689,7 +2689,7 @@
             <w:r>
               <w:rPr>
                 <w:b/>
-                <w:color w:val="0B3D63"/>
+                <w:color w:val="0B2A5B"/>
               </w:rPr>
               <w:t>Código</w:t>
             </w:r>
@@ -2700,7 +2700,7 @@
             <w:tcW w:type="dxa" w:w="7937"/>
             <w:shd w:val="clear" w:color="auto" w:fill="DCE6F5"/>
             <w:tcBorders>
-              <w:bottom w:val="single" w:sz="8" w:space="0" w:color="0B3D63"/>
+              <w:bottom w:val="single" w:sz="8" w:space="0" w:color="0B2A5B"/>
             </w:tcBorders>
           </w:tcPr>
           <w:p>
@@ -2711,7 +2711,7 @@
             <w:r>
               <w:rPr>
                 <w:b/>
-                <w:color w:val="0B3D63"/>
+                <w:color w:val="0B2A5B"/>
               </w:rPr>
               <w:t>Documento</w:t>
             </w:r>
@@ -2962,14 +2962,14 @@
       <w:pPr>
         <w:pStyle w:val="DestaquePCMD"/>
         <w:pBdr>
-          <w:left w:val="single" w:sz="24" w:space="6" w:color="0B3D63"/>
+          <w:left w:val="single" w:sz="24" w:space="6" w:color="0B2A5B"/>
         </w:pBdr>
         <w:shd w:val="clear" w:color="auto" w:fill="EEF2F8"/>
       </w:pPr>
       <w:r>
         <w:rPr>
           <w:rFonts w:ascii="Arial Black" w:hAnsi="Arial Black" w:cs="Arial Black"/>
-          <w:color w:val="0B3D63"/>
+          <w:color w:val="0B2A5B"/>
           <w:sz w:val="16"/>
         </w:rPr>
         <w:t xml:space="preserve">NOTA   </w:t>
@@ -3024,7 +3024,7 @@
             <w:tcW w:type="dxa" w:w="2381"/>
             <w:shd w:val="clear" w:color="auto" w:fill="DCE6F5"/>
             <w:tcBorders>
-              <w:bottom w:val="single" w:sz="8" w:space="0" w:color="0B3D63"/>
+              <w:bottom w:val="single" w:sz="8" w:space="0" w:color="0B2A5B"/>
             </w:tcBorders>
           </w:tcPr>
           <w:p>
@@ -3035,7 +3035,7 @@
             <w:r>
               <w:rPr>
                 <w:b/>
-                <w:color w:val="0B3D63"/>
+                <w:color w:val="0B2A5B"/>
               </w:rPr>
               <w:t>Indicador</w:t>
             </w:r>
@@ -3046,7 +3046,7 @@
             <w:tcW w:type="dxa" w:w="5443"/>
             <w:shd w:val="clear" w:color="auto" w:fill="DCE6F5"/>
             <w:tcBorders>
-              <w:bottom w:val="single" w:sz="8" w:space="0" w:color="0B3D63"/>
+              <w:bottom w:val="single" w:sz="8" w:space="0" w:color="0B2A5B"/>
             </w:tcBorders>
           </w:tcPr>
           <w:p>
@@ -3057,7 +3057,7 @@
             <w:r>
               <w:rPr>
                 <w:b/>
-                <w:color w:val="0B3D63"/>
+                <w:color w:val="0B2A5B"/>
               </w:rPr>
               <w:t>Regra explícita</w:t>
             </w:r>
@@ -3068,7 +3068,7 @@
             <w:tcW w:type="dxa" w:w="1814"/>
             <w:shd w:val="clear" w:color="auto" w:fill="DCE6F5"/>
             <w:tcBorders>
-              <w:bottom w:val="single" w:sz="8" w:space="0" w:color="0B3D63"/>
+              <w:bottom w:val="single" w:sz="8" w:space="0" w:color="0B2A5B"/>
             </w:tcBorders>
           </w:tcPr>
           <w:p>
@@ -3079,7 +3079,7 @@
             <w:r>
               <w:rPr>
                 <w:b/>
-                <w:color w:val="0B3D63"/>
+                <w:color w:val="0B2A5B"/>
               </w:rPr>
               <w:t>Meta</w:t>
             </w:r>
@@ -3322,7 +3322,7 @@
             <w:tcW w:type="dxa" w:w="567"/>
             <w:shd w:val="clear" w:color="auto" w:fill="DCE6F5"/>
             <w:tcBorders>
-              <w:bottom w:val="single" w:sz="8" w:space="0" w:color="0B3D63"/>
+              <w:bottom w:val="single" w:sz="8" w:space="0" w:color="0B2A5B"/>
             </w:tcBorders>
           </w:tcPr>
           <w:p>
@@ -3333,7 +3333,7 @@
             <w:r>
               <w:rPr>
                 <w:b/>
-                <w:color w:val="0B3D63"/>
+                <w:color w:val="0B2A5B"/>
               </w:rPr>
               <w:t>Nº</w:t>
             </w:r>
@@ -3344,7 +3344,7 @@
             <w:tcW w:type="dxa" w:w="6520"/>
             <w:shd w:val="clear" w:color="auto" w:fill="DCE6F5"/>
             <w:tcBorders>
-              <w:bottom w:val="single" w:sz="8" w:space="0" w:color="0B3D63"/>
+              <w:bottom w:val="single" w:sz="8" w:space="0" w:color="0B2A5B"/>
             </w:tcBorders>
           </w:tcPr>
           <w:p>
@@ -3355,7 +3355,7 @@
             <w:r>
               <w:rPr>
                 <w:b/>
-                <w:color w:val="0B3D63"/>
+                <w:color w:val="0B2A5B"/>
               </w:rPr>
               <w:t>Item de conferência</w:t>
             </w:r>
@@ -3366,7 +3366,7 @@
             <w:tcW w:type="dxa" w:w="2551"/>
             <w:shd w:val="clear" w:color="auto" w:fill="DCE6F5"/>
             <w:tcBorders>
-              <w:bottom w:val="single" w:sz="8" w:space="0" w:color="0B3D63"/>
+              <w:bottom w:val="single" w:sz="8" w:space="0" w:color="0B2A5B"/>
             </w:tcBorders>
           </w:tcPr>
           <w:p>
@@ -3377,7 +3377,7 @@
             <w:r>
               <w:rPr>
                 <w:b/>
-                <w:color w:val="0B3D63"/>
+                <w:color w:val="0B2A5B"/>
               </w:rPr>
               <w:t>Conferido por / data</w:t>
             </w:r>
@@ -3684,7 +3684,7 @@
             <w:r>
               <w:rPr>
                 <w:b/>
-                <w:color w:val="0B3D63"/>
+                <w:color w:val="0B2A5B"/>
               </w:rPr>
               <w:t>Situação</w:t>
             </w:r>
@@ -3715,7 +3715,7 @@
             <w:r>
               <w:rPr>
                 <w:b/>
-                <w:color w:val="0B3D63"/>
+                <w:color w:val="0B2A5B"/>
               </w:rPr>
               <w:t>Próxima revisão</w:t>
             </w:r>
@@ -3751,7 +3751,7 @@
             <w:r>
               <w:rPr>
                 <w:b/>
-                <w:color w:val="0B3D63"/>
+                <w:color w:val="0B2A5B"/>
               </w:rPr>
               <w:t>Origem dos dados</w:t>
             </w:r>
@@ -3782,7 +3782,7 @@
             <w:r>
               <w:rPr>
                 <w:b/>
-                <w:color w:val="0B3D63"/>
+                <w:color w:val="0B2A5B"/>
               </w:rPr>
               <w:t>Data de emissão</w:t>
             </w:r>
@@ -3841,7 +3841,7 @@
             <w:tcW w:type="dxa" w:w="3402"/>
             <w:shd w:val="clear" w:color="auto" w:fill="DCE6F5"/>
             <w:tcBorders>
-              <w:bottom w:val="single" w:sz="8" w:space="0" w:color="0B3D63"/>
+              <w:bottom w:val="single" w:sz="8" w:space="0" w:color="0B2A5B"/>
             </w:tcBorders>
           </w:tcPr>
           <w:p>
@@ -3852,7 +3852,7 @@
             <w:r>
               <w:rPr>
                 <w:b/>
-                <w:color w:val="0B3D63"/>
+                <w:color w:val="0B2A5B"/>
               </w:rPr>
               <w:t>Registro</w:t>
             </w:r>
@@ -3863,7 +3863,7 @@
             <w:tcW w:type="dxa" w:w="6236"/>
             <w:shd w:val="clear" w:color="auto" w:fill="DCE6F5"/>
             <w:tcBorders>
-              <w:bottom w:val="single" w:sz="8" w:space="0" w:color="0B3D63"/>
+              <w:bottom w:val="single" w:sz="8" w:space="0" w:color="0B2A5B"/>
             </w:tcBorders>
           </w:tcPr>
           <w:p>
@@ -3874,7 +3874,7 @@
             <w:r>
               <w:rPr>
                 <w:b/>
-                <w:color w:val="0B3D63"/>
+                <w:color w:val="0B2A5B"/>
               </w:rPr>
               <w:t>Onde fica</w:t>
             </w:r>
@@ -3910,7 +3910,7 @@
               <w:pStyle w:val="TabelaPCMD"/>
             </w:pPr>
             <w:r>
-              <w:t>PCMD-02 (abas Ativos, Critérios e Setores); resumo no Anexo A</w:t>
+              <w:t>PCMD-02 (abas Ativos e Cadastros); resumo no Anexo A</w:t>
             </w:r>
           </w:p>
         </w:tc>
@@ -3944,7 +3944,7 @@
               <w:pStyle w:val="TabelaPCMD"/>
             </w:pPr>
             <w:r>
-              <w:t>PCMD-01 (abas Pessoas, Requisitos, Lista Mestra e Revisões)</w:t>
+              <w:t>PCMD-01 (abas Cadastros, Lista Mestra e Revisões)</w:t>
             </w:r>
           </w:p>
         </w:tc>
@@ -4050,7 +4050,7 @@
             <w:tcW w:type="dxa" w:w="1134"/>
             <w:shd w:val="clear" w:color="auto" w:fill="DCE6F5"/>
             <w:tcBorders>
-              <w:bottom w:val="single" w:sz="8" w:space="0" w:color="0B3D63"/>
+              <w:bottom w:val="single" w:sz="8" w:space="0" w:color="0B2A5B"/>
             </w:tcBorders>
           </w:tcPr>
           <w:p>
@@ -4061,7 +4061,7 @@
             <w:r>
               <w:rPr>
                 <w:b/>
-                <w:color w:val="0B3D63"/>
+                <w:color w:val="0B2A5B"/>
               </w:rPr>
               <w:t>Revisão</w:t>
             </w:r>
@@ -4072,7 +4072,7 @@
             <w:tcW w:type="dxa" w:w="1587"/>
             <w:shd w:val="clear" w:color="auto" w:fill="DCE6F5"/>
             <w:tcBorders>
-              <w:bottom w:val="single" w:sz="8" w:space="0" w:color="0B3D63"/>
+              <w:bottom w:val="single" w:sz="8" w:space="0" w:color="0B2A5B"/>
             </w:tcBorders>
           </w:tcPr>
           <w:p>
@@ -4083,7 +4083,7 @@
             <w:r>
               <w:rPr>
                 <w:b/>
-                <w:color w:val="0B3D63"/>
+                <w:color w:val="0B2A5B"/>
               </w:rPr>
               <w:t>Data</w:t>
             </w:r>
@@ -4094,7 +4094,7 @@
             <w:tcW w:type="dxa" w:w="4649"/>
             <w:shd w:val="clear" w:color="auto" w:fill="DCE6F5"/>
             <w:tcBorders>
-              <w:bottom w:val="single" w:sz="8" w:space="0" w:color="0B3D63"/>
+              <w:bottom w:val="single" w:sz="8" w:space="0" w:color="0B2A5B"/>
             </w:tcBorders>
           </w:tcPr>
           <w:p>
@@ -4105,7 +4105,7 @@
             <w:r>
               <w:rPr>
                 <w:b/>
-                <w:color w:val="0B3D63"/>
+                <w:color w:val="0B2A5B"/>
               </w:rPr>
               <w:t>Descrição da mudança</w:t>
             </w:r>
@@ -4116,7 +4116,7 @@
             <w:tcW w:type="dxa" w:w="2268"/>
             <w:shd w:val="clear" w:color="auto" w:fill="DCE6F5"/>
             <w:tcBorders>
-              <w:bottom w:val="single" w:sz="8" w:space="0" w:color="0B3D63"/>
+              <w:bottom w:val="single" w:sz="8" w:space="0" w:color="0B2A5B"/>
             </w:tcBorders>
           </w:tcPr>
           <w:p>
@@ -4127,7 +4127,7 @@
             <w:r>
               <w:rPr>
                 <w:b/>
-                <w:color w:val="0B3D63"/>
+                <w:color w:val="0B2A5B"/>
               </w:rPr>
               <w:t>Responsável</w:t>
             </w:r>
@@ -4273,7 +4273,7 @@
             <w:tcW w:type="dxa" w:w="1474"/>
             <w:shd w:val="clear" w:color="auto" w:fill="DCE6F5"/>
             <w:tcBorders>
-              <w:bottom w:val="single" w:sz="8" w:space="0" w:color="0B3D63"/>
+              <w:bottom w:val="single" w:sz="8" w:space="0" w:color="0B2A5B"/>
             </w:tcBorders>
           </w:tcPr>
           <w:p>
@@ -4284,7 +4284,7 @@
             <w:r>
               <w:rPr>
                 <w:b/>
-                <w:color w:val="0B3D63"/>
+                <w:color w:val="0B2A5B"/>
               </w:rPr>
               <w:t>TAG</w:t>
             </w:r>
@@ -4295,7 +4295,7 @@
             <w:tcW w:type="dxa" w:w="3628"/>
             <w:shd w:val="clear" w:color="auto" w:fill="DCE6F5"/>
             <w:tcBorders>
-              <w:bottom w:val="single" w:sz="8" w:space="0" w:color="0B3D63"/>
+              <w:bottom w:val="single" w:sz="8" w:space="0" w:color="0B2A5B"/>
             </w:tcBorders>
           </w:tcPr>
           <w:p>
@@ -4306,7 +4306,7 @@
             <w:r>
               <w:rPr>
                 <w:b/>
-                <w:color w:val="0B3D63"/>
+                <w:color w:val="0B2A5B"/>
               </w:rPr>
               <w:t>Descrição</w:t>
             </w:r>
@@ -4317,7 +4317,7 @@
             <w:tcW w:type="dxa" w:w="794"/>
             <w:shd w:val="clear" w:color="auto" w:fill="DCE6F5"/>
             <w:tcBorders>
-              <w:bottom w:val="single" w:sz="8" w:space="0" w:color="0B3D63"/>
+              <w:bottom w:val="single" w:sz="8" w:space="0" w:color="0B2A5B"/>
             </w:tcBorders>
           </w:tcPr>
           <w:p>
@@ -4328,7 +4328,7 @@
             <w:r>
               <w:rPr>
                 <w:b/>
-                <w:color w:val="0B3D63"/>
+                <w:color w:val="0B2A5B"/>
               </w:rPr>
               <w:t>Setor</w:t>
             </w:r>
@@ -4339,7 +4339,7 @@
             <w:tcW w:type="dxa" w:w="1928"/>
             <w:shd w:val="clear" w:color="auto" w:fill="DCE6F5"/>
             <w:tcBorders>
-              <w:bottom w:val="single" w:sz="8" w:space="0" w:color="0B3D63"/>
+              <w:bottom w:val="single" w:sz="8" w:space="0" w:color="0B2A5B"/>
             </w:tcBorders>
           </w:tcPr>
           <w:p>
@@ -4350,7 +4350,7 @@
             <w:r>
               <w:rPr>
                 <w:b/>
-                <w:color w:val="0B3D63"/>
+                <w:color w:val="0B2A5B"/>
               </w:rPr>
               <w:t>Tipo</w:t>
             </w:r>
@@ -4361,7 +4361,7 @@
             <w:tcW w:type="dxa" w:w="624"/>
             <w:shd w:val="clear" w:color="auto" w:fill="DCE6F5"/>
             <w:tcBorders>
-              <w:bottom w:val="single" w:sz="8" w:space="0" w:color="0B3D63"/>
+              <w:bottom w:val="single" w:sz="8" w:space="0" w:color="0B2A5B"/>
             </w:tcBorders>
           </w:tcPr>
           <w:p>
@@ -4372,7 +4372,7 @@
             <w:r>
               <w:rPr>
                 <w:b/>
-                <w:color w:val="0B3D63"/>
+                <w:color w:val="0B2A5B"/>
               </w:rPr>
               <w:t>N1</w:t>
             </w:r>
@@ -4383,7 +4383,7 @@
             <w:tcW w:type="dxa" w:w="624"/>
             <w:shd w:val="clear" w:color="auto" w:fill="DCE6F5"/>
             <w:tcBorders>
-              <w:bottom w:val="single" w:sz="8" w:space="0" w:color="0B3D63"/>
+              <w:bottom w:val="single" w:sz="8" w:space="0" w:color="0B2A5B"/>
             </w:tcBorders>
           </w:tcPr>
           <w:p>
@@ -4394,7 +4394,7 @@
             <w:r>
               <w:rPr>
                 <w:b/>
-                <w:color w:val="0B3D63"/>
+                <w:color w:val="0B2A5B"/>
               </w:rPr>
               <w:t>N2</w:t>
             </w:r>
@@ -4405,7 +4405,7 @@
             <w:tcW w:type="dxa" w:w="624"/>
             <w:shd w:val="clear" w:color="auto" w:fill="DCE6F5"/>
             <w:tcBorders>
-              <w:bottom w:val="single" w:sz="8" w:space="0" w:color="0B3D63"/>
+              <w:bottom w:val="single" w:sz="8" w:space="0" w:color="0B2A5B"/>
             </w:tcBorders>
           </w:tcPr>
           <w:p>
@@ -4416,7 +4416,7 @@
             <w:r>
               <w:rPr>
                 <w:b/>
-                <w:color w:val="0B3D63"/>
+                <w:color w:val="0B2A5B"/>
               </w:rPr>
               <w:t>N3</w:t>
             </w:r>
@@ -4427,7 +4427,7 @@
             <w:tcW w:type="dxa" w:w="624"/>
             <w:shd w:val="clear" w:color="auto" w:fill="DCE6F5"/>
             <w:tcBorders>
-              <w:bottom w:val="single" w:sz="8" w:space="0" w:color="0B3D63"/>
+              <w:bottom w:val="single" w:sz="8" w:space="0" w:color="0B2A5B"/>
             </w:tcBorders>
           </w:tcPr>
           <w:p>
@@ -4438,7 +4438,7 @@
             <w:r>
               <w:rPr>
                 <w:b/>
-                <w:color w:val="0B3D63"/>
+                <w:color w:val="0B2A5B"/>
               </w:rPr>
               <w:t>N4</w:t>
             </w:r>
@@ -4449,7 +4449,7 @@
             <w:tcW w:type="dxa" w:w="624"/>
             <w:shd w:val="clear" w:color="auto" w:fill="DCE6F5"/>
             <w:tcBorders>
-              <w:bottom w:val="single" w:sz="8" w:space="0" w:color="0B3D63"/>
+              <w:bottom w:val="single" w:sz="8" w:space="0" w:color="0B2A5B"/>
             </w:tcBorders>
           </w:tcPr>
           <w:p>
@@ -4460,7 +4460,7 @@
             <w:r>
               <w:rPr>
                 <w:b/>
-                <w:color w:val="0B3D63"/>
+                <w:color w:val="0B2A5B"/>
               </w:rPr>
               <w:t>N5</w:t>
             </w:r>
@@ -4471,7 +4471,7 @@
             <w:tcW w:type="dxa" w:w="1361"/>
             <w:shd w:val="clear" w:color="auto" w:fill="DCE6F5"/>
             <w:tcBorders>
-              <w:bottom w:val="single" w:sz="8" w:space="0" w:color="0B3D63"/>
+              <w:bottom w:val="single" w:sz="8" w:space="0" w:color="0B2A5B"/>
             </w:tcBorders>
           </w:tcPr>
           <w:p>
@@ -4482,7 +4482,7 @@
             <w:r>
               <w:rPr>
                 <w:b/>
-                <w:color w:val="0B3D63"/>
+                <w:color w:val="0B2A5B"/>
               </w:rPr>
               <w:t>Pontuação</w:t>
             </w:r>
@@ -4493,7 +4493,7 @@
             <w:tcW w:type="dxa" w:w="1134"/>
             <w:shd w:val="clear" w:color="auto" w:fill="DCE6F5"/>
             <w:tcBorders>
-              <w:bottom w:val="single" w:sz="8" w:space="0" w:color="0B3D63"/>
+              <w:bottom w:val="single" w:sz="8" w:space="0" w:color="0B2A5B"/>
             </w:tcBorders>
           </w:tcPr>
           <w:p>
@@ -4504,7 +4504,7 @@
             <w:r>
               <w:rPr>
                 <w:b/>
-                <w:color w:val="0B3D63"/>
+                <w:color w:val="0B2A5B"/>
               </w:rPr>
               <w:t>Classe</w:t>
             </w:r>
@@ -5365,7 +5365,7 @@
       <w:pStyle w:val="Header"/>
       <w:spacing w:before="0" w:after="0" w:lineRule="exact" w:line="340"/>
       <w:jc w:val="center"/>
-      <w:shd w:val="clear" w:color="auto" w:fill="0B3D63"/>
+      <w:shd w:val="clear" w:color="auto" w:fill="0B2A5B"/>
     </w:pPr>
     <w:r>
       <w:rPr>
@@ -5820,7 +5820,7 @@
       <w:jc w:val="left"/>
       <w:outlineLvl w:val="0"/>
       <w:pBdr>
-        <w:bottom w:val="single" w:sz="6" w:space="2" w:color="0B3D63"/>
+        <w:bottom w:val="single" w:sz="6" w:space="2" w:color="0B2A5B"/>
       </w:pBdr>
     </w:pPr>
     <w:rPr>
@@ -5828,7 +5828,7 @@
       <w:b w:val="0"/>
       <w:bCs/>
       <w:i w:val="0"/>
-      <w:color w:val="0B3D63"/>
+      <w:color w:val="0B2A5B"/>
       <w:sz w:val="22"/>
       <w:szCs w:val="28"/>
     </w:rPr>
@@ -5854,7 +5854,7 @@
       <w:b/>
       <w:bCs/>
       <w:i w:val="0"/>
-      <w:color w:val="0B3D63"/>
+      <w:color w:val="0B2A5B"/>
       <w:sz w:val="21"/>
       <w:szCs w:val="26"/>
     </w:rPr>
@@ -5880,7 +5880,7 @@
       <w:b/>
       <w:bCs/>
       <w:i w:val="0"/>
-      <w:color w:val="0B3D63"/>
+      <w:color w:val="0B2A5B"/>
       <w:sz w:val="20"/>
     </w:rPr>
   </w:style>

</xml_diff>

<commit_message>
Substitui modelos PCMD pelo novo pacote do mantenedor (#22)
* Substitui modelos PCMD pelo pacote recebido e adapta preenchimento

* Estabiliza conferência offline das prévias em PDF

---------

Co-authored-by: Codex <codex@openai.com>
</commit_message>
<xml_diff>
--- a/public/modelos/PCMD-W1-Manual-Gestao-Ativos-Exemplo.docx
+++ b/public/modelos/PCMD-W1-Manual-Gestao-Ativos-Exemplo.docx
@@ -49,14 +49,14 @@
       <w:pPr>
         <w:pStyle w:val="DestaquePCMD"/>
         <w:pBdr>
-          <w:left w:val="single" w:sz="24" w:space="6" w:color="0B3D63"/>
+          <w:left w:val="single" w:sz="24" w:space="6" w:color="0B2A5B"/>
         </w:pBdr>
         <w:shd w:val="clear" w:color="auto" w:fill="EEF2F8"/>
       </w:pPr>
       <w:r>
         <w:rPr>
           <w:rFonts w:ascii="Arial Black" w:hAnsi="Arial Black" w:cs="Arial Black"/>
-          <w:color w:val="0B3D63"/>
+          <w:color w:val="0B2A5B"/>
           <w:sz w:val="16"/>
         </w:rPr>
         <w:t xml:space="preserve">NOTA   </w:t>
@@ -71,7 +71,7 @@
         <w:keepNext/>
       </w:pPr>
       <w:r>
-        <w:t>Referências registradas (PCMD-01, aba Requisitos)</w:t>
+        <w:t>Referências registradas (PCMD-01, aba Cadastros)</w:t>
       </w:r>
     </w:p>
     <w:tbl>
@@ -114,7 +114,7 @@
             <w:tcW w:type="dxa" w:w="2948"/>
             <w:shd w:val="clear" w:color="auto" w:fill="DCE6F5"/>
             <w:tcBorders>
-              <w:bottom w:val="single" w:sz="8" w:space="0" w:color="0B3D63"/>
+              <w:bottom w:val="single" w:sz="8" w:space="0" w:color="0B2A5B"/>
             </w:tcBorders>
           </w:tcPr>
           <w:p>
@@ -125,7 +125,7 @@
             <w:r>
               <w:rPr>
                 <w:b/>
-                <w:color w:val="0B3D63"/>
+                <w:color w:val="0B2A5B"/>
               </w:rPr>
               <w:t>Referência</w:t>
             </w:r>
@@ -136,7 +136,7 @@
             <w:tcW w:type="dxa" w:w="1134"/>
             <w:shd w:val="clear" w:color="auto" w:fill="DCE6F5"/>
             <w:tcBorders>
-              <w:bottom w:val="single" w:sz="8" w:space="0" w:color="0B3D63"/>
+              <w:bottom w:val="single" w:sz="8" w:space="0" w:color="0B2A5B"/>
             </w:tcBorders>
           </w:tcPr>
           <w:p>
@@ -147,7 +147,7 @@
             <w:r>
               <w:rPr>
                 <w:b/>
-                <w:color w:val="0B3D63"/>
+                <w:color w:val="0B2A5B"/>
               </w:rPr>
               <w:t>Versão</w:t>
             </w:r>
@@ -158,7 +158,7 @@
             <w:tcW w:type="dxa" w:w="1304"/>
             <w:shd w:val="clear" w:color="auto" w:fill="DCE6F5"/>
             <w:tcBorders>
-              <w:bottom w:val="single" w:sz="8" w:space="0" w:color="0B3D63"/>
+              <w:bottom w:val="single" w:sz="8" w:space="0" w:color="0B2A5B"/>
             </w:tcBorders>
           </w:tcPr>
           <w:p>
@@ -169,7 +169,7 @@
             <w:r>
               <w:rPr>
                 <w:b/>
-                <w:color w:val="0B3D63"/>
+                <w:color w:val="0B2A5B"/>
               </w:rPr>
               <w:t>Data</w:t>
             </w:r>
@@ -180,7 +180,7 @@
             <w:tcW w:type="dxa" w:w="2665"/>
             <w:shd w:val="clear" w:color="auto" w:fill="DCE6F5"/>
             <w:tcBorders>
-              <w:bottom w:val="single" w:sz="8" w:space="0" w:color="0B3D63"/>
+              <w:bottom w:val="single" w:sz="8" w:space="0" w:color="0B2A5B"/>
             </w:tcBorders>
           </w:tcPr>
           <w:p>
@@ -191,7 +191,7 @@
             <w:r>
               <w:rPr>
                 <w:b/>
-                <w:color w:val="0B3D63"/>
+                <w:color w:val="0B2A5B"/>
               </w:rPr>
               <w:t>Fonte (HTTPS)</w:t>
             </w:r>
@@ -202,7 +202,7 @@
             <w:tcW w:type="dxa" w:w="1587"/>
             <w:shd w:val="clear" w:color="auto" w:fill="DCE6F5"/>
             <w:tcBorders>
-              <w:bottom w:val="single" w:sz="8" w:space="0" w:color="0B3D63"/>
+              <w:bottom w:val="single" w:sz="8" w:space="0" w:color="0B2A5B"/>
             </w:tcBorders>
           </w:tcPr>
           <w:p>
@@ -213,7 +213,7 @@
             <w:r>
               <w:rPr>
                 <w:b/>
-                <w:color w:val="0B3D63"/>
+                <w:color w:val="0B2A5B"/>
               </w:rPr>
               <w:t>Status</w:t>
             </w:r>
@@ -337,7 +337,7 @@
             <w:tcW w:type="dxa" w:w="2551"/>
             <w:shd w:val="clear" w:color="auto" w:fill="DCE6F5"/>
             <w:tcBorders>
-              <w:bottom w:val="single" w:sz="8" w:space="0" w:color="0B3D63"/>
+              <w:bottom w:val="single" w:sz="8" w:space="0" w:color="0B2A5B"/>
             </w:tcBorders>
           </w:tcPr>
           <w:p>
@@ -348,7 +348,7 @@
             <w:r>
               <w:rPr>
                 <w:b/>
-                <w:color w:val="0B3D63"/>
+                <w:color w:val="0B2A5B"/>
               </w:rPr>
               <w:t>Termo</w:t>
             </w:r>
@@ -359,7 +359,7 @@
             <w:tcW w:type="dxa" w:w="7087"/>
             <w:shd w:val="clear" w:color="auto" w:fill="DCE6F5"/>
             <w:tcBorders>
-              <w:bottom w:val="single" w:sz="8" w:space="0" w:color="0B3D63"/>
+              <w:bottom w:val="single" w:sz="8" w:space="0" w:color="0B2A5B"/>
             </w:tcBorders>
           </w:tcPr>
           <w:p>
@@ -370,7 +370,7 @@
             <w:r>
               <w:rPr>
                 <w:b/>
-                <w:color w:val="0B3D63"/>
+                <w:color w:val="0B2A5B"/>
               </w:rPr>
               <w:t>Definição</w:t>
             </w:r>
@@ -663,7 +663,7 @@
             <w:tcW w:type="dxa" w:w="2381"/>
             <w:shd w:val="clear" w:color="auto" w:fill="DCE6F5"/>
             <w:tcBorders>
-              <w:bottom w:val="single" w:sz="8" w:space="0" w:color="0B3D63"/>
+              <w:bottom w:val="single" w:sz="8" w:space="0" w:color="0B2A5B"/>
             </w:tcBorders>
           </w:tcPr>
           <w:p>
@@ -674,7 +674,7 @@
             <w:r>
               <w:rPr>
                 <w:b/>
-                <w:color w:val="0B3D63"/>
+                <w:color w:val="0B2A5B"/>
               </w:rPr>
               <w:t>Papel</w:t>
             </w:r>
@@ -685,7 +685,7 @@
             <w:tcW w:type="dxa" w:w="4989"/>
             <w:shd w:val="clear" w:color="auto" w:fill="DCE6F5"/>
             <w:tcBorders>
-              <w:bottom w:val="single" w:sz="8" w:space="0" w:color="0B3D63"/>
+              <w:bottom w:val="single" w:sz="8" w:space="0" w:color="0B2A5B"/>
             </w:tcBorders>
           </w:tcPr>
           <w:p>
@@ -696,7 +696,7 @@
             <w:r>
               <w:rPr>
                 <w:b/>
-                <w:color w:val="0B3D63"/>
+                <w:color w:val="0B2A5B"/>
               </w:rPr>
               <w:t>Responsabilidade</w:t>
             </w:r>
@@ -707,7 +707,7 @@
             <w:tcW w:type="dxa" w:w="2268"/>
             <w:shd w:val="clear" w:color="auto" w:fill="DCE6F5"/>
             <w:tcBorders>
-              <w:bottom w:val="single" w:sz="8" w:space="0" w:color="0B3D63"/>
+              <w:bottom w:val="single" w:sz="8" w:space="0" w:color="0B2A5B"/>
             </w:tcBorders>
           </w:tcPr>
           <w:p>
@@ -718,7 +718,7 @@
             <w:r>
               <w:rPr>
                 <w:b/>
-                <w:color w:val="0B3D63"/>
+                <w:color w:val="0B2A5B"/>
               </w:rPr>
               <w:t>Pessoa</w:t>
             </w:r>
@@ -921,7 +921,7 @@
         <w:keepNext/>
       </w:pPr>
       <w:r>
-        <w:t>Pessoas ativas (PCMD-01, aba Pessoas)</w:t>
+        <w:t>Pessoas ativas (PCMD-01, aba Cadastros)</w:t>
       </w:r>
     </w:p>
     <w:tbl>
@@ -963,7 +963,7 @@
             <w:tcW w:type="dxa" w:w="2268"/>
             <w:shd w:val="clear" w:color="auto" w:fill="DCE6F5"/>
             <w:tcBorders>
-              <w:bottom w:val="single" w:sz="8" w:space="0" w:color="0B3D63"/>
+              <w:bottom w:val="single" w:sz="8" w:space="0" w:color="0B2A5B"/>
             </w:tcBorders>
           </w:tcPr>
           <w:p>
@@ -974,7 +974,7 @@
             <w:r>
               <w:rPr>
                 <w:b/>
-                <w:color w:val="0B3D63"/>
+                <w:color w:val="0B2A5B"/>
               </w:rPr>
               <w:t>Nome</w:t>
             </w:r>
@@ -985,7 +985,7 @@
             <w:tcW w:type="dxa" w:w="2494"/>
             <w:shd w:val="clear" w:color="auto" w:fill="DCE6F5"/>
             <w:tcBorders>
-              <w:bottom w:val="single" w:sz="8" w:space="0" w:color="0B3D63"/>
+              <w:bottom w:val="single" w:sz="8" w:space="0" w:color="0B2A5B"/>
             </w:tcBorders>
           </w:tcPr>
           <w:p>
@@ -996,7 +996,7 @@
             <w:r>
               <w:rPr>
                 <w:b/>
-                <w:color w:val="0B3D63"/>
+                <w:color w:val="0B2A5B"/>
               </w:rPr>
               <w:t>Função</w:t>
             </w:r>
@@ -1007,7 +1007,7 @@
             <w:tcW w:type="dxa" w:w="1928"/>
             <w:shd w:val="clear" w:color="auto" w:fill="DCE6F5"/>
             <w:tcBorders>
-              <w:bottom w:val="single" w:sz="8" w:space="0" w:color="0B3D63"/>
+              <w:bottom w:val="single" w:sz="8" w:space="0" w:color="0B2A5B"/>
             </w:tcBorders>
           </w:tcPr>
           <w:p>
@@ -1018,7 +1018,7 @@
             <w:r>
               <w:rPr>
                 <w:b/>
-                <w:color w:val="0B3D63"/>
+                <w:color w:val="0B2A5B"/>
               </w:rPr>
               <w:t>Especialidade</w:t>
             </w:r>
@@ -1029,7 +1029,7 @@
             <w:tcW w:type="dxa" w:w="2948"/>
             <w:shd w:val="clear" w:color="auto" w:fill="DCE6F5"/>
             <w:tcBorders>
-              <w:bottom w:val="single" w:sz="8" w:space="0" w:color="0B3D63"/>
+              <w:bottom w:val="single" w:sz="8" w:space="0" w:color="0B2A5B"/>
             </w:tcBorders>
           </w:tcPr>
           <w:p>
@@ -1040,7 +1040,7 @@
             <w:r>
               <w:rPr>
                 <w:b/>
-                <w:color w:val="0B3D63"/>
+                <w:color w:val="0B2A5B"/>
               </w:rPr>
               <w:t>Responsabilidade neste manual (manual)</w:t>
             </w:r>
@@ -1099,7 +1099,7 @@
               <w:pStyle w:val="TabelaPCMD"/>
             </w:pPr>
             <w:r>
-              <w:t>A definir</w:t>
+              <w:t>Elabora e mantém os registros</w:t>
             </w:r>
           </w:p>
         </w:tc>
@@ -1156,7 +1156,7 @@
               <w:pStyle w:val="TabelaPCMD"/>
             </w:pPr>
             <w:r>
-              <w:t>A definir</w:t>
+              <w:t>Executa e registra as tarefas</w:t>
             </w:r>
           </w:p>
         </w:tc>
@@ -1229,7 +1229,7 @@
             <w:tcW w:type="dxa" w:w="1984"/>
             <w:shd w:val="clear" w:color="auto" w:fill="DCE6F5"/>
             <w:tcBorders>
-              <w:bottom w:val="single" w:sz="8" w:space="0" w:color="0B3D63"/>
+              <w:bottom w:val="single" w:sz="8" w:space="0" w:color="0B2A5B"/>
             </w:tcBorders>
           </w:tcPr>
           <w:p>
@@ -1240,7 +1240,7 @@
             <w:r>
               <w:rPr>
                 <w:b/>
-                <w:color w:val="0B3D63"/>
+                <w:color w:val="0B2A5B"/>
               </w:rPr>
               <w:t>Item</w:t>
             </w:r>
@@ -1251,7 +1251,7 @@
             <w:tcW w:type="dxa" w:w="7654"/>
             <w:shd w:val="clear" w:color="auto" w:fill="DCE6F5"/>
             <w:tcBorders>
-              <w:bottom w:val="single" w:sz="8" w:space="0" w:color="0B3D63"/>
+              <w:bottom w:val="single" w:sz="8" w:space="0" w:color="0B2A5B"/>
             </w:tcBorders>
           </w:tcPr>
           <w:p>
@@ -1262,7 +1262,7 @@
             <w:r>
               <w:rPr>
                 <w:b/>
-                <w:color w:val="0B3D63"/>
+                <w:color w:val="0B2A5B"/>
               </w:rPr>
               <w:t>Regra</w:t>
             </w:r>
@@ -1413,7 +1413,7 @@
         <w:keepNext/>
       </w:pPr>
       <w:r>
-        <w:t>Setores cadastrados (PCMD-02, aba Setores)</w:t>
+        <w:t>Setores cadastrados (PCMD-02, aba Cadastros)</w:t>
       </w:r>
     </w:p>
     <w:tbl>
@@ -1453,7 +1453,7 @@
             <w:tcW w:type="dxa" w:w="1701"/>
             <w:shd w:val="clear" w:color="auto" w:fill="DCE6F5"/>
             <w:tcBorders>
-              <w:bottom w:val="single" w:sz="8" w:space="0" w:color="0B3D63"/>
+              <w:bottom w:val="single" w:sz="8" w:space="0" w:color="0B2A5B"/>
             </w:tcBorders>
           </w:tcPr>
           <w:p>
@@ -1464,7 +1464,7 @@
             <w:r>
               <w:rPr>
                 <w:b/>
-                <w:color w:val="0B3D63"/>
+                <w:color w:val="0B2A5B"/>
               </w:rPr>
               <w:t>Sigla</w:t>
             </w:r>
@@ -1475,7 +1475,7 @@
             <w:tcW w:type="dxa" w:w="7937"/>
             <w:shd w:val="clear" w:color="auto" w:fill="DCE6F5"/>
             <w:tcBorders>
-              <w:bottom w:val="single" w:sz="8" w:space="0" w:color="0B3D63"/>
+              <w:bottom w:val="single" w:sz="8" w:space="0" w:color="0B2A5B"/>
             </w:tcBorders>
           </w:tcPr>
           <w:p>
@@ -1486,7 +1486,7 @@
             <w:r>
               <w:rPr>
                 <w:b/>
-                <w:color w:val="0B3D63"/>
+                <w:color w:val="0B2A5B"/>
               </w:rPr>
               <w:t>Descrição (manual)</w:t>
             </w:r>
@@ -1519,7 +1519,7 @@
               <w:pStyle w:val="TabelaPCMD"/>
             </w:pPr>
             <w:r>
-              <w:t>A definir</w:t>
+              <w:t>Utilidades</w:t>
             </w:r>
           </w:p>
         </w:tc>
@@ -1550,7 +1550,7 @@
               <w:pStyle w:val="TabelaPCMD"/>
             </w:pPr>
             <w:r>
-              <w:t>A definir</w:t>
+              <w:t>Produção</w:t>
             </w:r>
           </w:p>
         </w:tc>
@@ -1581,7 +1581,7 @@
               <w:pStyle w:val="TabelaPCMD"/>
             </w:pPr>
             <w:r>
-              <w:t>A definir</w:t>
+              <w:t>Expedição</w:t>
             </w:r>
           </w:p>
         </w:tc>
@@ -1647,7 +1647,7 @@
             <w:tcW w:type="dxa" w:w="6803"/>
             <w:shd w:val="clear" w:color="auto" w:fill="DCE6F5"/>
             <w:tcBorders>
-              <w:bottom w:val="single" w:sz="8" w:space="0" w:color="0B3D63"/>
+              <w:bottom w:val="single" w:sz="8" w:space="0" w:color="0B2A5B"/>
             </w:tcBorders>
           </w:tcPr>
           <w:p>
@@ -1658,7 +1658,7 @@
             <w:r>
               <w:rPr>
                 <w:b/>
-                <w:color w:val="0B3D63"/>
+                <w:color w:val="0B2A5B"/>
               </w:rPr>
               <w:t>Situação</w:t>
             </w:r>
@@ -1669,7 +1669,7 @@
             <w:tcW w:type="dxa" w:w="2835"/>
             <w:shd w:val="clear" w:color="auto" w:fill="DCE6F5"/>
             <w:tcBorders>
-              <w:bottom w:val="single" w:sz="8" w:space="0" w:color="0B3D63"/>
+              <w:bottom w:val="single" w:sz="8" w:space="0" w:color="0B2A5B"/>
             </w:tcBorders>
           </w:tcPr>
           <w:p>
@@ -1680,7 +1680,7 @@
             <w:r>
               <w:rPr>
                 <w:b/>
-                <w:color w:val="0B3D63"/>
+                <w:color w:val="0B2A5B"/>
               </w:rPr>
               <w:t>Classe</w:t>
             </w:r>
@@ -1965,7 +1965,7 @@
             <w:tcW w:type="dxa" w:w="2494"/>
             <w:shd w:val="clear" w:color="auto" w:fill="DCE6F5"/>
             <w:tcBorders>
-              <w:bottom w:val="single" w:sz="8" w:space="0" w:color="0B3D63"/>
+              <w:bottom w:val="single" w:sz="8" w:space="0" w:color="0B2A5B"/>
             </w:tcBorders>
           </w:tcPr>
           <w:p>
@@ -1976,7 +1976,7 @@
             <w:r>
               <w:rPr>
                 <w:b/>
-                <w:color w:val="0B3D63"/>
+                <w:color w:val="0B2A5B"/>
               </w:rPr>
               <w:t>Critério</w:t>
             </w:r>
@@ -1987,7 +1987,7 @@
             <w:tcW w:type="dxa" w:w="2381"/>
             <w:shd w:val="clear" w:color="auto" w:fill="DCE6F5"/>
             <w:tcBorders>
-              <w:bottom w:val="single" w:sz="8" w:space="0" w:color="0B3D63"/>
+              <w:bottom w:val="single" w:sz="8" w:space="0" w:color="0B2A5B"/>
             </w:tcBorders>
           </w:tcPr>
           <w:p>
@@ -1998,7 +1998,7 @@
             <w:r>
               <w:rPr>
                 <w:b/>
-                <w:color w:val="0B3D63"/>
+                <w:color w:val="0B2A5B"/>
               </w:rPr>
               <w:t>Nível 1</w:t>
             </w:r>
@@ -2009,7 +2009,7 @@
             <w:tcW w:type="dxa" w:w="2381"/>
             <w:shd w:val="clear" w:color="auto" w:fill="DCE6F5"/>
             <w:tcBorders>
-              <w:bottom w:val="single" w:sz="8" w:space="0" w:color="0B3D63"/>
+              <w:bottom w:val="single" w:sz="8" w:space="0" w:color="0B2A5B"/>
             </w:tcBorders>
           </w:tcPr>
           <w:p>
@@ -2020,7 +2020,7 @@
             <w:r>
               <w:rPr>
                 <w:b/>
-                <w:color w:val="0B3D63"/>
+                <w:color w:val="0B2A5B"/>
               </w:rPr>
               <w:t>Nível 2</w:t>
             </w:r>
@@ -2031,7 +2031,7 @@
             <w:tcW w:type="dxa" w:w="2381"/>
             <w:shd w:val="clear" w:color="auto" w:fill="DCE6F5"/>
             <w:tcBorders>
-              <w:bottom w:val="single" w:sz="8" w:space="0" w:color="0B3D63"/>
+              <w:bottom w:val="single" w:sz="8" w:space="0" w:color="0B2A5B"/>
             </w:tcBorders>
           </w:tcPr>
           <w:p>
@@ -2042,7 +2042,7 @@
             <w:r>
               <w:rPr>
                 <w:b/>
-                <w:color w:val="0B3D63"/>
+                <w:color w:val="0B2A5B"/>
               </w:rPr>
               <w:t>Nível 3</w:t>
             </w:r>
@@ -2078,7 +2078,7 @@
               <w:pStyle w:val="TabelaPCMD"/>
             </w:pPr>
             <w:r>
-              <w:t>A definir pelo mantenedor</w:t>
+              <w:t>Sem risco à pessoa</w:t>
             </w:r>
           </w:p>
         </w:tc>
@@ -2091,7 +2091,7 @@
               <w:pStyle w:val="TabelaPCMD"/>
             </w:pPr>
             <w:r>
-              <w:t>A definir pelo mantenedor</w:t>
+              <w:t>Risco leve, controlado por EPI</w:t>
             </w:r>
           </w:p>
         </w:tc>
@@ -2104,7 +2104,7 @@
               <w:pStyle w:val="TabelaPCMD"/>
             </w:pPr>
             <w:r>
-              <w:t>A definir pelo mantenedor</w:t>
+              <w:t>Risco grave à pessoa</w:t>
             </w:r>
           </w:p>
         </w:tc>
@@ -2138,7 +2138,7 @@
               <w:pStyle w:val="TabelaPCMD"/>
             </w:pPr>
             <w:r>
-              <w:t>A definir pelo mantenedor</w:t>
+              <w:t>Sem efeito no produto</w:t>
             </w:r>
           </w:p>
         </w:tc>
@@ -2151,7 +2151,7 @@
               <w:pStyle w:val="TabelaPCMD"/>
             </w:pPr>
             <w:r>
-              <w:t>A definir pelo mantenedor</w:t>
+              <w:t>Gera retrabalho</w:t>
             </w:r>
           </w:p>
         </w:tc>
@@ -2164,7 +2164,7 @@
               <w:pStyle w:val="TabelaPCMD"/>
             </w:pPr>
             <w:r>
-              <w:t>A definir pelo mantenedor</w:t>
+              <w:t>Gera refugo ou reclamação</w:t>
             </w:r>
           </w:p>
         </w:tc>
@@ -2198,7 +2198,7 @@
               <w:pStyle w:val="TabelaPCMD"/>
             </w:pPr>
             <w:r>
-              <w:t>A definir pelo mantenedor</w:t>
+              <w:t>Não afeta a produção</w:t>
             </w:r>
           </w:p>
         </w:tc>
@@ -2211,7 +2211,7 @@
               <w:pStyle w:val="TabelaPCMD"/>
             </w:pPr>
             <w:r>
-              <w:t>A definir pelo mantenedor</w:t>
+              <w:t>Reduz o ritmo</w:t>
             </w:r>
           </w:p>
         </w:tc>
@@ -2224,7 +2224,7 @@
               <w:pStyle w:val="TabelaPCMD"/>
             </w:pPr>
             <w:r>
-              <w:t>A definir pelo mantenedor</w:t>
+              <w:t>Para a produção</w:t>
             </w:r>
           </w:p>
         </w:tc>
@@ -2258,7 +2258,7 @@
               <w:pStyle w:val="TabelaPCMD"/>
             </w:pPr>
             <w:r>
-              <w:t>A definir pelo mantenedor</w:t>
+              <w:t>Rara (mais de 1 ano)</w:t>
             </w:r>
           </w:p>
         </w:tc>
@@ -2271,7 +2271,7 @@
               <w:pStyle w:val="TabelaPCMD"/>
             </w:pPr>
             <w:r>
-              <w:t>A definir pelo mantenedor</w:t>
+              <w:t>Ocasional (1 a 12 meses)</w:t>
             </w:r>
           </w:p>
         </w:tc>
@@ -2284,7 +2284,7 @@
               <w:pStyle w:val="TabelaPCMD"/>
             </w:pPr>
             <w:r>
-              <w:t>A definir pelo mantenedor</w:t>
+              <w:t>Frequente (menos de 1 mês)</w:t>
             </w:r>
           </w:p>
         </w:tc>
@@ -2318,7 +2318,7 @@
               <w:pStyle w:val="TabelaPCMD"/>
             </w:pPr>
             <w:r>
-              <w:t>A definir pelo mantenedor</w:t>
+              <w:t>Reparo em até 4 h</w:t>
             </w:r>
           </w:p>
         </w:tc>
@@ -2331,7 +2331,7 @@
               <w:pStyle w:val="TabelaPCMD"/>
             </w:pPr>
             <w:r>
-              <w:t>A definir pelo mantenedor</w:t>
+              <w:t>Reparo de 4 a 24 h</w:t>
             </w:r>
           </w:p>
         </w:tc>
@@ -2344,7 +2344,7 @@
               <w:pStyle w:val="TabelaPCMD"/>
             </w:pPr>
             <w:r>
-              <w:t>A definir pelo mantenedor</w:t>
+              <w:t>Reparo acima de 24 h</w:t>
             </w:r>
           </w:p>
         </w:tc>
@@ -2355,14 +2355,14 @@
       <w:pPr>
         <w:pStyle w:val="DestaquePCMD"/>
         <w:pBdr>
-          <w:left w:val="single" w:sz="24" w:space="6" w:color="0B3D63"/>
+          <w:left w:val="single" w:sz="24" w:space="6" w:color="0B2A5B"/>
         </w:pBdr>
         <w:shd w:val="clear" w:color="auto" w:fill="EEF2F8"/>
       </w:pPr>
       <w:r>
         <w:rPr>
           <w:rFonts w:ascii="Arial Black" w:hAnsi="Arial Black" w:cs="Arial Black"/>
-          <w:color w:val="0B3D63"/>
+          <w:color w:val="0B2A5B"/>
           <w:sz w:val="16"/>
         </w:rPr>
         <w:t xml:space="preserve">NOTA   </w:t>
@@ -2416,7 +2416,7 @@
             <w:tcW w:type="dxa" w:w="3118"/>
             <w:shd w:val="clear" w:color="auto" w:fill="DCE6F5"/>
             <w:tcBorders>
-              <w:bottom w:val="single" w:sz="8" w:space="0" w:color="0B3D63"/>
+              <w:bottom w:val="single" w:sz="8" w:space="0" w:color="0B2A5B"/>
             </w:tcBorders>
           </w:tcPr>
           <w:p>
@@ -2427,7 +2427,7 @@
             <w:r>
               <w:rPr>
                 <w:b/>
-                <w:color w:val="0B3D63"/>
+                <w:color w:val="0B2A5B"/>
               </w:rPr>
               <w:t>Situação</w:t>
             </w:r>
@@ -2438,7 +2438,7 @@
             <w:tcW w:type="dxa" w:w="6520"/>
             <w:shd w:val="clear" w:color="auto" w:fill="DCE6F5"/>
             <w:tcBorders>
-              <w:bottom w:val="single" w:sz="8" w:space="0" w:color="0B3D63"/>
+              <w:bottom w:val="single" w:sz="8" w:space="0" w:color="0B2A5B"/>
             </w:tcBorders>
           </w:tcPr>
           <w:p>
@@ -2449,7 +2449,7 @@
             <w:r>
               <w:rPr>
                 <w:b/>
-                <w:color w:val="0B3D63"/>
+                <w:color w:val="0B2A5B"/>
               </w:rPr>
               <w:t>O que acontece</w:t>
             </w:r>
@@ -2678,7 +2678,7 @@
             <w:tcW w:type="dxa" w:w="1701"/>
             <w:shd w:val="clear" w:color="auto" w:fill="DCE6F5"/>
             <w:tcBorders>
-              <w:bottom w:val="single" w:sz="8" w:space="0" w:color="0B3D63"/>
+              <w:bottom w:val="single" w:sz="8" w:space="0" w:color="0B2A5B"/>
             </w:tcBorders>
           </w:tcPr>
           <w:p>
@@ -2689,7 +2689,7 @@
             <w:r>
               <w:rPr>
                 <w:b/>
-                <w:color w:val="0B3D63"/>
+                <w:color w:val="0B2A5B"/>
               </w:rPr>
               <w:t>Código</w:t>
             </w:r>
@@ -2700,7 +2700,7 @@
             <w:tcW w:type="dxa" w:w="7937"/>
             <w:shd w:val="clear" w:color="auto" w:fill="DCE6F5"/>
             <w:tcBorders>
-              <w:bottom w:val="single" w:sz="8" w:space="0" w:color="0B3D63"/>
+              <w:bottom w:val="single" w:sz="8" w:space="0" w:color="0B2A5B"/>
             </w:tcBorders>
           </w:tcPr>
           <w:p>
@@ -2711,7 +2711,7 @@
             <w:r>
               <w:rPr>
                 <w:b/>
-                <w:color w:val="0B3D63"/>
+                <w:color w:val="0B2A5B"/>
               </w:rPr>
               <w:t>Documento</w:t>
             </w:r>
@@ -2962,14 +2962,14 @@
       <w:pPr>
         <w:pStyle w:val="DestaquePCMD"/>
         <w:pBdr>
-          <w:left w:val="single" w:sz="24" w:space="6" w:color="0B3D63"/>
+          <w:left w:val="single" w:sz="24" w:space="6" w:color="0B2A5B"/>
         </w:pBdr>
         <w:shd w:val="clear" w:color="auto" w:fill="EEF2F8"/>
       </w:pPr>
       <w:r>
         <w:rPr>
           <w:rFonts w:ascii="Arial Black" w:hAnsi="Arial Black" w:cs="Arial Black"/>
-          <w:color w:val="0B3D63"/>
+          <w:color w:val="0B2A5B"/>
           <w:sz w:val="16"/>
         </w:rPr>
         <w:t xml:space="preserve">NOTA   </w:t>
@@ -3024,7 +3024,7 @@
             <w:tcW w:type="dxa" w:w="2381"/>
             <w:shd w:val="clear" w:color="auto" w:fill="DCE6F5"/>
             <w:tcBorders>
-              <w:bottom w:val="single" w:sz="8" w:space="0" w:color="0B3D63"/>
+              <w:bottom w:val="single" w:sz="8" w:space="0" w:color="0B2A5B"/>
             </w:tcBorders>
           </w:tcPr>
           <w:p>
@@ -3035,7 +3035,7 @@
             <w:r>
               <w:rPr>
                 <w:b/>
-                <w:color w:val="0B3D63"/>
+                <w:color w:val="0B2A5B"/>
               </w:rPr>
               <w:t>Indicador</w:t>
             </w:r>
@@ -3046,7 +3046,7 @@
             <w:tcW w:type="dxa" w:w="5443"/>
             <w:shd w:val="clear" w:color="auto" w:fill="DCE6F5"/>
             <w:tcBorders>
-              <w:bottom w:val="single" w:sz="8" w:space="0" w:color="0B3D63"/>
+              <w:bottom w:val="single" w:sz="8" w:space="0" w:color="0B2A5B"/>
             </w:tcBorders>
           </w:tcPr>
           <w:p>
@@ -3057,7 +3057,7 @@
             <w:r>
               <w:rPr>
                 <w:b/>
-                <w:color w:val="0B3D63"/>
+                <w:color w:val="0B2A5B"/>
               </w:rPr>
               <w:t>Regra explícita</w:t>
             </w:r>
@@ -3068,7 +3068,7 @@
             <w:tcW w:type="dxa" w:w="1814"/>
             <w:shd w:val="clear" w:color="auto" w:fill="DCE6F5"/>
             <w:tcBorders>
-              <w:bottom w:val="single" w:sz="8" w:space="0" w:color="0B3D63"/>
+              <w:bottom w:val="single" w:sz="8" w:space="0" w:color="0B2A5B"/>
             </w:tcBorders>
           </w:tcPr>
           <w:p>
@@ -3079,7 +3079,7 @@
             <w:r>
               <w:rPr>
                 <w:b/>
-                <w:color w:val="0B3D63"/>
+                <w:color w:val="0B2A5B"/>
               </w:rPr>
               <w:t>Meta</w:t>
             </w:r>
@@ -3322,7 +3322,7 @@
             <w:tcW w:type="dxa" w:w="567"/>
             <w:shd w:val="clear" w:color="auto" w:fill="DCE6F5"/>
             <w:tcBorders>
-              <w:bottom w:val="single" w:sz="8" w:space="0" w:color="0B3D63"/>
+              <w:bottom w:val="single" w:sz="8" w:space="0" w:color="0B2A5B"/>
             </w:tcBorders>
           </w:tcPr>
           <w:p>
@@ -3333,7 +3333,7 @@
             <w:r>
               <w:rPr>
                 <w:b/>
-                <w:color w:val="0B3D63"/>
+                <w:color w:val="0B2A5B"/>
               </w:rPr>
               <w:t>Nº</w:t>
             </w:r>
@@ -3344,7 +3344,7 @@
             <w:tcW w:type="dxa" w:w="6520"/>
             <w:shd w:val="clear" w:color="auto" w:fill="DCE6F5"/>
             <w:tcBorders>
-              <w:bottom w:val="single" w:sz="8" w:space="0" w:color="0B3D63"/>
+              <w:bottom w:val="single" w:sz="8" w:space="0" w:color="0B2A5B"/>
             </w:tcBorders>
           </w:tcPr>
           <w:p>
@@ -3355,7 +3355,7 @@
             <w:r>
               <w:rPr>
                 <w:b/>
-                <w:color w:val="0B3D63"/>
+                <w:color w:val="0B2A5B"/>
               </w:rPr>
               <w:t>Item de conferência</w:t>
             </w:r>
@@ -3366,7 +3366,7 @@
             <w:tcW w:type="dxa" w:w="2551"/>
             <w:shd w:val="clear" w:color="auto" w:fill="DCE6F5"/>
             <w:tcBorders>
-              <w:bottom w:val="single" w:sz="8" w:space="0" w:color="0B3D63"/>
+              <w:bottom w:val="single" w:sz="8" w:space="0" w:color="0B2A5B"/>
             </w:tcBorders>
           </w:tcPr>
           <w:p>
@@ -3377,7 +3377,7 @@
             <w:r>
               <w:rPr>
                 <w:b/>
-                <w:color w:val="0B3D63"/>
+                <w:color w:val="0B2A5B"/>
               </w:rPr>
               <w:t>Conferido por / data</w:t>
             </w:r>
@@ -3684,7 +3684,7 @@
             <w:r>
               <w:rPr>
                 <w:b/>
-                <w:color w:val="0B3D63"/>
+                <w:color w:val="0B2A5B"/>
               </w:rPr>
               <w:t>Situação</w:t>
             </w:r>
@@ -3715,7 +3715,7 @@
             <w:r>
               <w:rPr>
                 <w:b/>
-                <w:color w:val="0B3D63"/>
+                <w:color w:val="0B2A5B"/>
               </w:rPr>
               <w:t>Próxima revisão</w:t>
             </w:r>
@@ -3751,7 +3751,7 @@
             <w:r>
               <w:rPr>
                 <w:b/>
-                <w:color w:val="0B3D63"/>
+                <w:color w:val="0B2A5B"/>
               </w:rPr>
               <w:t>Origem dos dados</w:t>
             </w:r>
@@ -3782,7 +3782,7 @@
             <w:r>
               <w:rPr>
                 <w:b/>
-                <w:color w:val="0B3D63"/>
+                <w:color w:val="0B2A5B"/>
               </w:rPr>
               <w:t>Data de emissão</w:t>
             </w:r>
@@ -3841,7 +3841,7 @@
             <w:tcW w:type="dxa" w:w="3402"/>
             <w:shd w:val="clear" w:color="auto" w:fill="DCE6F5"/>
             <w:tcBorders>
-              <w:bottom w:val="single" w:sz="8" w:space="0" w:color="0B3D63"/>
+              <w:bottom w:val="single" w:sz="8" w:space="0" w:color="0B2A5B"/>
             </w:tcBorders>
           </w:tcPr>
           <w:p>
@@ -3852,7 +3852,7 @@
             <w:r>
               <w:rPr>
                 <w:b/>
-                <w:color w:val="0B3D63"/>
+                <w:color w:val="0B2A5B"/>
               </w:rPr>
               <w:t>Registro</w:t>
             </w:r>
@@ -3863,7 +3863,7 @@
             <w:tcW w:type="dxa" w:w="6236"/>
             <w:shd w:val="clear" w:color="auto" w:fill="DCE6F5"/>
             <w:tcBorders>
-              <w:bottom w:val="single" w:sz="8" w:space="0" w:color="0B3D63"/>
+              <w:bottom w:val="single" w:sz="8" w:space="0" w:color="0B2A5B"/>
             </w:tcBorders>
           </w:tcPr>
           <w:p>
@@ -3874,7 +3874,7 @@
             <w:r>
               <w:rPr>
                 <w:b/>
-                <w:color w:val="0B3D63"/>
+                <w:color w:val="0B2A5B"/>
               </w:rPr>
               <w:t>Onde fica</w:t>
             </w:r>
@@ -3910,7 +3910,7 @@
               <w:pStyle w:val="TabelaPCMD"/>
             </w:pPr>
             <w:r>
-              <w:t>PCMD-02 (abas Ativos, Critérios e Setores); resumo no Anexo A</w:t>
+              <w:t>PCMD-02 (abas Ativos e Cadastros); resumo no Anexo A</w:t>
             </w:r>
           </w:p>
         </w:tc>
@@ -3944,7 +3944,7 @@
               <w:pStyle w:val="TabelaPCMD"/>
             </w:pPr>
             <w:r>
-              <w:t>PCMD-01 (abas Pessoas, Requisitos, Lista Mestra e Revisões)</w:t>
+              <w:t>PCMD-01 (abas Cadastros, Lista Mestra e Revisões)</w:t>
             </w:r>
           </w:p>
         </w:tc>
@@ -4050,7 +4050,7 @@
             <w:tcW w:type="dxa" w:w="1134"/>
             <w:shd w:val="clear" w:color="auto" w:fill="DCE6F5"/>
             <w:tcBorders>
-              <w:bottom w:val="single" w:sz="8" w:space="0" w:color="0B3D63"/>
+              <w:bottom w:val="single" w:sz="8" w:space="0" w:color="0B2A5B"/>
             </w:tcBorders>
           </w:tcPr>
           <w:p>
@@ -4061,7 +4061,7 @@
             <w:r>
               <w:rPr>
                 <w:b/>
-                <w:color w:val="0B3D63"/>
+                <w:color w:val="0B2A5B"/>
               </w:rPr>
               <w:t>Revisão</w:t>
             </w:r>
@@ -4072,7 +4072,7 @@
             <w:tcW w:type="dxa" w:w="1587"/>
             <w:shd w:val="clear" w:color="auto" w:fill="DCE6F5"/>
             <w:tcBorders>
-              <w:bottom w:val="single" w:sz="8" w:space="0" w:color="0B3D63"/>
+              <w:bottom w:val="single" w:sz="8" w:space="0" w:color="0B2A5B"/>
             </w:tcBorders>
           </w:tcPr>
           <w:p>
@@ -4083,7 +4083,7 @@
             <w:r>
               <w:rPr>
                 <w:b/>
-                <w:color w:val="0B3D63"/>
+                <w:color w:val="0B2A5B"/>
               </w:rPr>
               <w:t>Data</w:t>
             </w:r>
@@ -4094,7 +4094,7 @@
             <w:tcW w:type="dxa" w:w="4649"/>
             <w:shd w:val="clear" w:color="auto" w:fill="DCE6F5"/>
             <w:tcBorders>
-              <w:bottom w:val="single" w:sz="8" w:space="0" w:color="0B3D63"/>
+              <w:bottom w:val="single" w:sz="8" w:space="0" w:color="0B2A5B"/>
             </w:tcBorders>
           </w:tcPr>
           <w:p>
@@ -4105,7 +4105,7 @@
             <w:r>
               <w:rPr>
                 <w:b/>
-                <w:color w:val="0B3D63"/>
+                <w:color w:val="0B2A5B"/>
               </w:rPr>
               <w:t>Descrição da mudança</w:t>
             </w:r>
@@ -4116,7 +4116,7 @@
             <w:tcW w:type="dxa" w:w="2268"/>
             <w:shd w:val="clear" w:color="auto" w:fill="DCE6F5"/>
             <w:tcBorders>
-              <w:bottom w:val="single" w:sz="8" w:space="0" w:color="0B3D63"/>
+              <w:bottom w:val="single" w:sz="8" w:space="0" w:color="0B2A5B"/>
             </w:tcBorders>
           </w:tcPr>
           <w:p>
@@ -4127,7 +4127,7 @@
             <w:r>
               <w:rPr>
                 <w:b/>
-                <w:color w:val="0B3D63"/>
+                <w:color w:val="0B2A5B"/>
               </w:rPr>
               <w:t>Responsável</w:t>
             </w:r>
@@ -4273,7 +4273,7 @@
             <w:tcW w:type="dxa" w:w="1474"/>
             <w:shd w:val="clear" w:color="auto" w:fill="DCE6F5"/>
             <w:tcBorders>
-              <w:bottom w:val="single" w:sz="8" w:space="0" w:color="0B3D63"/>
+              <w:bottom w:val="single" w:sz="8" w:space="0" w:color="0B2A5B"/>
             </w:tcBorders>
           </w:tcPr>
           <w:p>
@@ -4284,7 +4284,7 @@
             <w:r>
               <w:rPr>
                 <w:b/>
-                <w:color w:val="0B3D63"/>
+                <w:color w:val="0B2A5B"/>
               </w:rPr>
               <w:t>TAG</w:t>
             </w:r>
@@ -4295,7 +4295,7 @@
             <w:tcW w:type="dxa" w:w="3628"/>
             <w:shd w:val="clear" w:color="auto" w:fill="DCE6F5"/>
             <w:tcBorders>
-              <w:bottom w:val="single" w:sz="8" w:space="0" w:color="0B3D63"/>
+              <w:bottom w:val="single" w:sz="8" w:space="0" w:color="0B2A5B"/>
             </w:tcBorders>
           </w:tcPr>
           <w:p>
@@ -4306,7 +4306,7 @@
             <w:r>
               <w:rPr>
                 <w:b/>
-                <w:color w:val="0B3D63"/>
+                <w:color w:val="0B2A5B"/>
               </w:rPr>
               <w:t>Descrição</w:t>
             </w:r>
@@ -4317,7 +4317,7 @@
             <w:tcW w:type="dxa" w:w="794"/>
             <w:shd w:val="clear" w:color="auto" w:fill="DCE6F5"/>
             <w:tcBorders>
-              <w:bottom w:val="single" w:sz="8" w:space="0" w:color="0B3D63"/>
+              <w:bottom w:val="single" w:sz="8" w:space="0" w:color="0B2A5B"/>
             </w:tcBorders>
           </w:tcPr>
           <w:p>
@@ -4328,7 +4328,7 @@
             <w:r>
               <w:rPr>
                 <w:b/>
-                <w:color w:val="0B3D63"/>
+                <w:color w:val="0B2A5B"/>
               </w:rPr>
               <w:t>Setor</w:t>
             </w:r>
@@ -4339,7 +4339,7 @@
             <w:tcW w:type="dxa" w:w="1928"/>
             <w:shd w:val="clear" w:color="auto" w:fill="DCE6F5"/>
             <w:tcBorders>
-              <w:bottom w:val="single" w:sz="8" w:space="0" w:color="0B3D63"/>
+              <w:bottom w:val="single" w:sz="8" w:space="0" w:color="0B2A5B"/>
             </w:tcBorders>
           </w:tcPr>
           <w:p>
@@ -4350,7 +4350,7 @@
             <w:r>
               <w:rPr>
                 <w:b/>
-                <w:color w:val="0B3D63"/>
+                <w:color w:val="0B2A5B"/>
               </w:rPr>
               <w:t>Tipo</w:t>
             </w:r>
@@ -4361,7 +4361,7 @@
             <w:tcW w:type="dxa" w:w="624"/>
             <w:shd w:val="clear" w:color="auto" w:fill="DCE6F5"/>
             <w:tcBorders>
-              <w:bottom w:val="single" w:sz="8" w:space="0" w:color="0B3D63"/>
+              <w:bottom w:val="single" w:sz="8" w:space="0" w:color="0B2A5B"/>
             </w:tcBorders>
           </w:tcPr>
           <w:p>
@@ -4372,7 +4372,7 @@
             <w:r>
               <w:rPr>
                 <w:b/>
-                <w:color w:val="0B3D63"/>
+                <w:color w:val="0B2A5B"/>
               </w:rPr>
               <w:t>N1</w:t>
             </w:r>
@@ -4383,7 +4383,7 @@
             <w:tcW w:type="dxa" w:w="624"/>
             <w:shd w:val="clear" w:color="auto" w:fill="DCE6F5"/>
             <w:tcBorders>
-              <w:bottom w:val="single" w:sz="8" w:space="0" w:color="0B3D63"/>
+              <w:bottom w:val="single" w:sz="8" w:space="0" w:color="0B2A5B"/>
             </w:tcBorders>
           </w:tcPr>
           <w:p>
@@ -4394,7 +4394,7 @@
             <w:r>
               <w:rPr>
                 <w:b/>
-                <w:color w:val="0B3D63"/>
+                <w:color w:val="0B2A5B"/>
               </w:rPr>
               <w:t>N2</w:t>
             </w:r>
@@ -4405,7 +4405,7 @@
             <w:tcW w:type="dxa" w:w="624"/>
             <w:shd w:val="clear" w:color="auto" w:fill="DCE6F5"/>
             <w:tcBorders>
-              <w:bottom w:val="single" w:sz="8" w:space="0" w:color="0B3D63"/>
+              <w:bottom w:val="single" w:sz="8" w:space="0" w:color="0B2A5B"/>
             </w:tcBorders>
           </w:tcPr>
           <w:p>
@@ -4416,7 +4416,7 @@
             <w:r>
               <w:rPr>
                 <w:b/>
-                <w:color w:val="0B3D63"/>
+                <w:color w:val="0B2A5B"/>
               </w:rPr>
               <w:t>N3</w:t>
             </w:r>
@@ -4427,7 +4427,7 @@
             <w:tcW w:type="dxa" w:w="624"/>
             <w:shd w:val="clear" w:color="auto" w:fill="DCE6F5"/>
             <w:tcBorders>
-              <w:bottom w:val="single" w:sz="8" w:space="0" w:color="0B3D63"/>
+              <w:bottom w:val="single" w:sz="8" w:space="0" w:color="0B2A5B"/>
             </w:tcBorders>
           </w:tcPr>
           <w:p>
@@ -4438,7 +4438,7 @@
             <w:r>
               <w:rPr>
                 <w:b/>
-                <w:color w:val="0B3D63"/>
+                <w:color w:val="0B2A5B"/>
               </w:rPr>
               <w:t>N4</w:t>
             </w:r>
@@ -4449,7 +4449,7 @@
             <w:tcW w:type="dxa" w:w="624"/>
             <w:shd w:val="clear" w:color="auto" w:fill="DCE6F5"/>
             <w:tcBorders>
-              <w:bottom w:val="single" w:sz="8" w:space="0" w:color="0B3D63"/>
+              <w:bottom w:val="single" w:sz="8" w:space="0" w:color="0B2A5B"/>
             </w:tcBorders>
           </w:tcPr>
           <w:p>
@@ -4460,7 +4460,7 @@
             <w:r>
               <w:rPr>
                 <w:b/>
-                <w:color w:val="0B3D63"/>
+                <w:color w:val="0B2A5B"/>
               </w:rPr>
               <w:t>N5</w:t>
             </w:r>
@@ -4471,7 +4471,7 @@
             <w:tcW w:type="dxa" w:w="1361"/>
             <w:shd w:val="clear" w:color="auto" w:fill="DCE6F5"/>
             <w:tcBorders>
-              <w:bottom w:val="single" w:sz="8" w:space="0" w:color="0B3D63"/>
+              <w:bottom w:val="single" w:sz="8" w:space="0" w:color="0B2A5B"/>
             </w:tcBorders>
           </w:tcPr>
           <w:p>
@@ -4482,7 +4482,7 @@
             <w:r>
               <w:rPr>
                 <w:b/>
-                <w:color w:val="0B3D63"/>
+                <w:color w:val="0B2A5B"/>
               </w:rPr>
               <w:t>Pontuação</w:t>
             </w:r>
@@ -4493,7 +4493,7 @@
             <w:tcW w:type="dxa" w:w="1134"/>
             <w:shd w:val="clear" w:color="auto" w:fill="DCE6F5"/>
             <w:tcBorders>
-              <w:bottom w:val="single" w:sz="8" w:space="0" w:color="0B3D63"/>
+              <w:bottom w:val="single" w:sz="8" w:space="0" w:color="0B2A5B"/>
             </w:tcBorders>
           </w:tcPr>
           <w:p>
@@ -4504,7 +4504,7 @@
             <w:r>
               <w:rPr>
                 <w:b/>
-                <w:color w:val="0B3D63"/>
+                <w:color w:val="0B2A5B"/>
               </w:rPr>
               <w:t>Classe</w:t>
             </w:r>
@@ -5365,7 +5365,7 @@
       <w:pStyle w:val="Header"/>
       <w:spacing w:before="0" w:after="0" w:lineRule="exact" w:line="340"/>
       <w:jc w:val="center"/>
-      <w:shd w:val="clear" w:color="auto" w:fill="0B3D63"/>
+      <w:shd w:val="clear" w:color="auto" w:fill="0B2A5B"/>
     </w:pPr>
     <w:r>
       <w:rPr>
@@ -5820,7 +5820,7 @@
       <w:jc w:val="left"/>
       <w:outlineLvl w:val="0"/>
       <w:pBdr>
-        <w:bottom w:val="single" w:sz="6" w:space="2" w:color="0B3D63"/>
+        <w:bottom w:val="single" w:sz="6" w:space="2" w:color="0B2A5B"/>
       </w:pBdr>
     </w:pPr>
     <w:rPr>
@@ -5828,7 +5828,7 @@
       <w:b w:val="0"/>
       <w:bCs/>
       <w:i w:val="0"/>
-      <w:color w:val="0B3D63"/>
+      <w:color w:val="0B2A5B"/>
       <w:sz w:val="22"/>
       <w:szCs w:val="28"/>
     </w:rPr>
@@ -5854,7 +5854,7 @@
       <w:b/>
       <w:bCs/>
       <w:i w:val="0"/>
-      <w:color w:val="0B3D63"/>
+      <w:color w:val="0B2A5B"/>
       <w:sz w:val="21"/>
       <w:szCs w:val="26"/>
     </w:rPr>
@@ -5880,7 +5880,7 @@
       <w:b/>
       <w:bCs/>
       <w:i w:val="0"/>
-      <w:color w:val="0B3D63"/>
+      <w:color w:val="0B2A5B"/>
       <w:sz w:val="20"/>
     </w:rPr>
   </w:style>

</xml_diff>

<commit_message>
Aplicar logo oficial aos modelos de gestão e suas prévias
</commit_message>
<xml_diff>
--- a/public/modelos/PCMD-W1-Manual-Gestao-Ativos-Exemplo.docx
+++ b/public/modelos/PCMD-W1-Manual-Gestao-Ativos-Exemplo.docx
@@ -5223,7 +5223,7 @@
           <w:r>
             <w:drawing>
               <wp:inline xmlns:a="http://schemas.openxmlformats.org/drawingml/2006/main" xmlns:pic="http://schemas.openxmlformats.org/drawingml/2006/picture">
-                <wp:extent cx="1512000" cy="353516"/>
+                <wp:extent cx="1221418" cy="353516"/>
                 <wp:docPr id="1" name="Picture 1"/>
                 <wp:cNvGraphicFramePr>
                   <a:graphicFrameLocks noChangeAspect="1"/>
@@ -5244,7 +5244,7 @@
                       <pic:spPr>
                         <a:xfrm>
                           <a:off x="0" y="0"/>
-                          <a:ext cx="1512000" cy="353516"/>
+                          <a:ext cx="1221418" cy="353516"/>
                         </a:xfrm>
                         <a:prstGeom prst="rect"/>
                       </pic:spPr>

</xml_diff>